<commit_message>
Add GitHub repository URL to project documentation and course paper
</commit_message>
<xml_diff>
--- a/Windows程序设计课程作业-ImageProcessingTool.docx
+++ b/Windows程序设计课程作业-ImageProcessingTool.docx
@@ -2522,6 +2522,19 @@
           <w:sz w:val="21"/>
         </w:rPr>
         <w:t>详见随项目源码一同提交的 Project_Proposal.md 文件，内容包括：项目背景、功能需求分析、技术选型理由、系统架构设计、开发环境说明及项目clone地址。</w:t>
+      </w:r>
+    </w:p>
+    <w:p>
+      <w:pPr>
+        <w:ind w:firstLine="0"/>
+      </w:pPr>
+      <w:r>
+        <w:rPr>
+          <w:rFonts w:ascii="宋体" w:hAnsi="宋体" w:eastAsia="宋体"/>
+          <w:b/>
+          <w:sz w:val="21"/>
+        </w:rPr>
+        <w:t>项目GitHub仓库地址：https://github.com/Xentire/Windows-.git</w:t>
       </w:r>
     </w:p>
     <w:p>

</xml_diff>

<commit_message>
Update course paper to personal-style version
</commit_message>
<xml_diff>
--- a/Windows程序设计课程作业-ImageProcessingTool.docx
+++ b/Windows程序设计课程作业-ImageProcessingTool.docx
@@ -152,7 +152,7 @@
           <w:rFonts w:ascii="宋体" w:hAnsi="宋体" w:eastAsia="宋体"/>
           <w:sz w:val="21"/>
         </w:rPr>
-        <w:t>C#是由微软公司开发的一种面向对象的、运行于.NET Framework和.NET Core之上的高级程序设计语言。C#继承了C和C++的强大功能，同时去除了宏、多重继承等复杂特性，具有语法简洁、类型安全、自动垃圾回收等优点。在本课程的学习过程中，C#基础语法是整个Windows程序设计的基石，涵盖了变量与数据类型、流程控制语句、面向对象编程三大特性（封装、继承、多态）、委托与事件、泛型集合、LINQ查询表达式以及异步编程模型等核心知识点。</w:t>
+        <w:t>这学期从零开始接触C#。之前只在大一学过一点C语言，属于那种能看懂的层次，真让自己写就犯怵。C#给我的第一印象是——它把很多C/C++里容易踩坑的地方替你挡掉了。比如内存管理，以前写C的时候malloc/free搞不清楚就内存泄漏，C#有GC，虽然不是说可以完全不操心资源释放，但至少大部分时候你不用盯着每一处new去配delete。</w:t>
       </w:r>
     </w:p>
     <w:p>
@@ -161,29 +161,7 @@
           <w:rFonts w:ascii="宋体" w:hAnsi="宋体" w:eastAsia="宋体"/>
           <w:sz w:val="21"/>
         </w:rPr>
-        <w:t>C#的委托（Delegate）和事件（Event）机制是实现WinForms事件驱动编程的基础。当用户点击按钮、选择菜单项或调整滑块时，系统通过委托回调相应的事件处理方法，这一机制贯穿了本课程项目的整个UI层设计。在本次图像处理工具项目中，所有菜单项和工具栏按钮的响应都通过Lambda表达式绑定事件处理器实现，例如滤镜头应用按钮直接绑定异步处理方法：</w:t>
-      </w:r>
-    </w:p>
-    <w:p>
-      <w:pPr>
-        <w:spacing w:before="120" w:after="120"/>
-        <w:ind w:firstLine="0"/>
-      </w:pPr>
-      <w:r>
-        <w:rPr>
-          <w:rFonts w:ascii="Consolas" w:hAnsi="Consolas"/>
-          <w:sz w:val="18"/>
-        </w:rPr>
-        <w:t>new ToolStripMenuItem("&amp;Grayscale", null,</w:t>
-        <w:br/>
-      </w:r>
-      <w:r>
-        <w:rPr>
-          <w:rFonts w:ascii="Consolas" w:hAnsi="Consolas"/>
-          <w:sz w:val="18"/>
-        </w:rPr>
-        <w:t xml:space="preserve">    (_, _) =&gt; ApplyFilter(ImageProcessor.Grayscale, "Grayscale"));</w:t>
-        <w:br/>
+        <w:t>学面向对象那部分的时候，我其实一开始挺懵的。封装、继承、多态，课本上的例子看懂了，一动手就不知道怎么拆分类。后来是在实验课上做那个学生管理系统的练习，把Student类和Course类分开，再写一个GradeManager来关联它们，才慢慢体会到"一个类只干一件事"的道理。这个习惯在后面做图像处理项目时帮了大忙——ImageProcessor就只负责算法，文件读写交给ImageFileHandler，UI的事归MainForm管。各管各的，改一个地方不用操心另一个地方崩溃。</w:t>
       </w:r>
     </w:p>
     <w:p>
@@ -192,7 +170,7 @@
           <w:rFonts w:ascii="宋体" w:hAnsi="宋体" w:eastAsia="宋体"/>
           <w:sz w:val="21"/>
         </w:rPr>
-        <w:t>泛型集合（Generic Collections）如List&lt;T&gt;、Dictionary&lt;TKey,TValue&gt;、Stack&lt;T&gt;等在本项目中得到了广泛应用。撤销/重做管理器（UndoRedoManager）使用Stack&lt;Bitmap&gt;来维护操作历史，利用Stack的后进先出（LIFO）特性自然地实现了撤销/重做的语义。</w:t>
+        <w:t>委托和事件这块花了我不少时间理解。说实话，刚学的时候觉得这语法好奇怪——为什么要把方法当参数传来传去？直到写WinForms界面，给按钮绑点击事件：btn.Click += (s, e) =&gt; { ... }，才突然明白这就是委托啊。lambda表达式写起来确实比单独声明一个方法再绑定简洁太多了。项目中所有菜单项和工具栏按钮都用lambda绑的，我个人感觉这是C#里用得最舒服的特性之一。</w:t>
       </w:r>
     </w:p>
     <w:p>
@@ -201,7 +179,7 @@
           <w:rFonts w:ascii="宋体" w:hAnsi="宋体" w:eastAsia="宋体"/>
           <w:sz w:val="21"/>
         </w:rPr>
-        <w:t>异步编程模型async/await是本课程的重要教学内容。在图像处理中，某些滤镜（如大半径模糊、Sobel边缘检测）处理大尺寸图像时可能耗时数秒，若在主线程（UI线程）上执行将导致界面冻结。通过Task.Run将耗时计算转移到后台线程，结合IProgress&lt;T&gt;接口实现进度报告，保证了UI的流畅响应。</w:t>
+        <w:t>async/await也是这学期新学的东西。以前写程序都是同步的，一行执行完才走下一行。第一次遇到界面卡死的问题是在做网络编程实验的时候——主线程上发了个HTTP请求，等响应的过程中整个窗口拖都拖不动。后来理解了消息循环（message loop）这个东西：WinForms的UI线程就是在不断处理消息队列，你把它堵住了，界面当然动不了。Task.Run把重活扔给后台线程，配合IProgress报告进度，这个模式在这次图像处理项目里反复用到。</w:t>
       </w:r>
     </w:p>
     <w:p>
@@ -222,7 +200,7 @@
           <w:rFonts w:ascii="宋体" w:hAnsi="宋体" w:eastAsia="宋体"/>
           <w:sz w:val="21"/>
         </w:rPr>
-        <w:t>Windows Forms是.NET平台下用于构建Windows桌面应用程序的GUI框架，提供了丰富的控件库和设计时支持。本课程系统学习了Form窗体、MenuStrip菜单栏、ToolStrip工具栏、StatusStrip状态栏、Panel面板、PictureBox图片框、Button按钮、TextBox文本框、Label标签、NumericUpDown数值调节框、TrackBar滑块、CheckBox复选框、OpenFileDialog/SaveFileDialog文件对话框等核心控件。</w:t>
+        <w:t>WinForms给我的感觉是——它不像现在那些前端框架那么花哨，控件长得就是Windows原生风格，但是上手快，搭一个能用的工具软件效率很高。课程从最简单的Form和Button开始，逐步讲了容器控件（Panel、GroupBox、TabControl）、菜单工具栏（MenuStrip、ToolStrip、ContextMenuStrip）、数据显示控件（DataGridView、ListView、TreeView）和对话框（OpenFileDialog、SaveFileDialog、ColorDialog等）。</w:t>
       </w:r>
     </w:p>
     <w:p>
@@ -231,7 +209,7 @@
           <w:rFonts w:ascii="宋体" w:hAnsi="宋体" w:eastAsia="宋体"/>
           <w:sz w:val="21"/>
         </w:rPr>
-        <w:t>MenuStrip和ToolStrip构成了应用程序的主要交互入口，本项目的MainForm通过MenuStrip提供了文件操作、编辑操作、滤镜、调整、变换和帮助六个主菜单，通过ToolStrip提供了常用操作的快捷访问。StatusStrip用于显示当前图像的尺寸、格式和文件大小等状态信息，同时在处理大图像时显示进度条。PictureBox配合Panel的AutoScroll属性实现了图像的滚动查看功能，当图像尺寸超过窗口可视区域时自动出现滚动条。</w:t>
+        <w:t>做这个图像处理项目的时候，MainForm的整个界面是我自己一行行代码搭的，没依赖设计器。一开始觉得手写布局好麻烦，各种Dock、Anchor、Padding调来调去。但写完之后反而觉得手写比拖控件更可控——你知道每个控件的定位逻辑是什么，出了问题也好排查。比如那个PictureBox要配合Panel实现滚动查看大图，核心就是两点：PictureBox设AutoSize让它的尺寸跟图片一样大，Panel设AutoScroll让它在内容超出可见区域时自动出滚动条。就这么两行属性的设置，搞懂了原理其实很简单。</w:t>
       </w:r>
     </w:p>
     <w:p>
@@ -240,7 +218,7 @@
           <w:rFonts w:ascii="宋体" w:hAnsi="宋体" w:eastAsia="宋体"/>
           <w:sz w:val="21"/>
         </w:rPr>
-        <w:t>对话框控件在本项目中也发挥了重要作用。OpenFileDialog和SaveFileDialog实现了标准化的文件选择，AdjustmentDialog（自定义对话框）使用TrackBar控件提供了亮度/对比度的可视化调节界面，ResizeDialog使用NumericUpDown控件实现了精确的图像尺寸调整。</w:t>
+        <w:t>StatusStrip的状态信息展示我个人觉得对用户体验提升特别大。没状态栏的时候，你打开一张图片，除了看到图本身，什么都不知道——多大的文件？什么格式？多少像素？加了状态栏之后，一打开图，底下直接显示"1920x1080 | JPEG | 2.3 MB"，心里就有数了。处理进度条也很实用，加个大半径模糊的时候可能要等几秒钟，有个进度条就不至于让用户以为程序卡死了。</w:t>
       </w:r>
     </w:p>
     <w:p>
@@ -261,7 +239,7 @@
           <w:rFonts w:ascii="宋体" w:hAnsi="宋体" w:eastAsia="宋体"/>
           <w:sz w:val="21"/>
         </w:rPr>
-        <w:t>并发控制是多线程编程中的核心问题，涉及线程安全、资源共享、死锁避免等关键概念。本课程重点讲授了C#中的Task Parallel Library（TPL）、async/await异步模式、线程池管理以及UI线程的安全更新机制。在WinForms应用中，所有对控件属性的修改必须在创建该控件的UI线程上执行，否则会引发跨线程操作异常。</w:t>
+        <w:t>并发这块说实话学得比较吃力。线程安全、锁、死锁这些概念光看书根本搞不明白，非得自己踩过坑才有感觉。印象最深的一次是做一个多线程下载的实验，开了5个线程同时写一个共享的List&lt;int&gt;，跑着跑着突然抛了个IndexOutOfRangeException，排查半天发现是两个线程同时执行Add操作导致内部数组扩容时数据错乱了。换成ConcurrentBag之后就再没出过这个问题。</w:t>
       </w:r>
     </w:p>
     <w:p>
@@ -270,7 +248,7 @@
           <w:rFonts w:ascii="宋体" w:hAnsi="宋体" w:eastAsia="宋体"/>
           <w:sz w:val="21"/>
         </w:rPr>
-        <w:t>本项目通过Progress&lt;T&gt;类解决了后台线程与UI线程之间的通信问题。Progress&lt;T&gt;内部捕获了SynchronizationContext，确保其Report回调在正确的线程（UI线程）上执行。在处理大图像时，后台线程每处理完一行像素即通过IProgress&lt;int&gt;.Report()报告进度，UI线程安全地更新进度条和状态文字，实现了流畅的用户体验。</w:t>
+        <w:t>图像处理项目里的并发倒没那么复杂——主要是单向的：后台线程处理图像，处理完了把结果Bitap传回UI线程显示。Progress&lt;T&gt;这个类设计得很妙，你不用手动Invoke或者BeginInvoke，它内部帮你把SynchronizationContext捕获好了，Report回调自动在正确的线程上执行。省了不少事。</w:t>
       </w:r>
     </w:p>
     <w:p>
@@ -282,7 +260,7 @@
           <w:rFonts w:ascii="黑体" w:hAnsi="黑体" w:eastAsia="黑体"/>
           <w:sz w:val="21"/>
         </w:rPr>
-        <w:t>1.1.4 网络连接</w:t>
+        <w:t>1.1.4 网络连接与文件处理</w:t>
       </w:r>
     </w:p>
     <w:p>
@@ -291,7 +269,7 @@
           <w:rFonts w:ascii="宋体" w:hAnsi="宋体" w:eastAsia="宋体"/>
           <w:sz w:val="21"/>
         </w:rPr>
-        <w:t>网络连接技术涉及Socket编程、HTTP协议通信、TCP/UDP数据传输等内容。本课程的实验项目中包含了基于TCP的简单聊天程序开发，使学生理解了客户端-服务器模型、网络流（NetworkStream）读写、数据序列化与反序列化等核心概念。C#提供了HttpClient类简化HTTP请求、TcpClient/TcpListener类支持TCP通信、UdpClient类支持UDP通信。</w:t>
+        <w:t>网络编程部分做了TCP聊天程序的实验，虽然这次图像处理工具没用到网络功能，但Socket编程的思路——建立连接、收发数据、关闭连接——对理解C/S架构帮助很大。HttpClient封装得比原始Socket好用太多了，一个GetAsync就能拿到响应，感觉微软在这块的API设计上下了功夫。</w:t>
       </w:r>
     </w:p>
     <w:p>
@@ -300,7 +278,7 @@
           <w:rFonts w:ascii="宋体" w:hAnsi="宋体" w:eastAsia="宋体"/>
           <w:sz w:val="21"/>
         </w:rPr>
-        <w:t>虽然本次图像处理工具项目以本地文件操作为主，但网络编程的知识为将来扩展网络功能（如在线图库浏览、云端图像同步等）打下了基础。</w:t>
+        <w:t>文件处理在项目里是实实在在用到的。ImageFileHandler的OpenImage方法没有直接调Bitmap.FromFile()，而是先把文件读到MemoryStream再从流创建Bitmap。为什么这么绕一下？因为Bitmap.FromFile()会一直锁着源文件，你想保存覆盖的时候就报"文件被占用"。用MemoryStream中转，读完马上释放文件句柄，后面再保存就不会有问题了。这个小细节是在StackOverflow上看到的，自己遇到之前完全想不到。</w:t>
       </w:r>
     </w:p>
     <w:p>
@@ -312,7 +290,7 @@
           <w:rFonts w:ascii="黑体" w:hAnsi="黑体" w:eastAsia="黑体"/>
           <w:sz w:val="21"/>
         </w:rPr>
-        <w:t>1.1.5 文件处理</w:t>
+        <w:t>1.1.5 图像处理技术</w:t>
       </w:r>
     </w:p>
     <w:p>
@@ -321,7 +299,7 @@
           <w:rFonts w:ascii="宋体" w:hAnsi="宋体" w:eastAsia="宋体"/>
           <w:sz w:val="21"/>
         </w:rPr>
-        <w:t>文件处理是应用程序持久化数据的核心手段。本课程涵盖了FileStream文件流读写、StreamReader/StreamWriter文本文件处理、BinaryReader/BinaryWriter二进制文件处理、Path路径操作、File/FileInfo文件信息管理以及MemoryStream内存流等知识点。</w:t>
+        <w:t>图像处理是这学期我觉得最有意思的部分，也是最后选来做期末项目的方向。课堂上讲了图像的基础表示——每个像素就是几个byte，灰度图一个byte，彩色图三个byte（RGB）或四个（ARGB）。听起来简单，但正是这个简单的模型支撑了所有复杂的图像算法。</w:t>
       </w:r>
     </w:p>
     <w:p>
@@ -330,7 +308,16 @@
           <w:rFonts w:ascii="宋体" w:hAnsi="宋体" w:eastAsia="宋体"/>
           <w:sz w:val="21"/>
         </w:rPr>
-        <w:t>在本项目中，ImageFileHandler类使用了MemoryStream作为中间缓冲区来打开图像文件。这一设计方案的优势在于：通过FileStream读取文件内容到MemoryStream后立即释放文件句柄，避免了传统Bitmap.FromFile()方法长期锁定文件导致无法保存覆盖的问题。SaveImage方法则根据文件扩展名自动选择对应的ImageFormat（JPEG、PNG、BMP、GIF等），实现了灵活的多格式支持。</w:t>
+        <w:t>GetPixel/SetPixel是入门用的，做做实验还行。真处理一张几百万像素的照片，这两个方法慢到你怀疑人生。为啥慢？因为每次调用GetPixel都要跨越托管代码和非托管GDI+代码之间的边界，这个"跨域"开销累积起来不得了。老师课上演示了LockBits的做法——直接把整个位图的内存区域锁住，拿到一个指针，然后你就可以像操作数组一样遍历像素了。配合unsafe代码块的指针运算，处理一张1920x1080的图从十来分钟降到一秒以内，这个对比太直观了。这也是我第一次写unsafe代码，一开始挺紧张，怕把内存搞崩了，后来发现只要搞清楚stride（每行的字节跨度，可能因为4字节对齐而大于width*3）和BGR的字节顺序，就没那么容易出错。</w:t>
+      </w:r>
+    </w:p>
+    <w:p>
+      <w:r>
+        <w:rPr>
+          <w:rFonts w:ascii="宋体" w:hAnsi="宋体" w:eastAsia="宋体"/>
+          <w:sz w:val="21"/>
+        </w:rPr>
+        <w:t>卷积那节课给我印象很深。之前总听说"模糊滤镜""锐化滤镜"这些词，但不知道背后就是简单的加权求和。一个3x3的小矩阵在图像上滑过去，每个位置的像素值用它和周围邻居的加权平均替代。模糊核就是大家都一样权重然后归一化，锐化核是中间权重大、旁边权重为负。Sobel边缘检测更有意思——用两个核分别算水平和垂直方向的梯度，然后勾股定理合成幅度。数学课学的矩阵和向量在这里全都用上了。</w:t>
       </w:r>
     </w:p>
     <w:p>
@@ -342,7 +329,7 @@
           <w:rFonts w:ascii="黑体" w:hAnsi="黑体" w:eastAsia="黑体"/>
           <w:sz w:val="21"/>
         </w:rPr>
-        <w:t>1.1.6 图像处理</w:t>
+        <w:t>1.1.6 数据库连接与处理</w:t>
       </w:r>
     </w:p>
     <w:p>
@@ -351,7 +338,7 @@
           <w:rFonts w:ascii="宋体" w:hAnsi="宋体" w:eastAsia="宋体"/>
           <w:sz w:val="21"/>
         </w:rPr>
-        <w:t>图像处理是本课程的重点教学内容，也是本次期末项目选定的核心技术方向。课程涵盖了GDI+图形编程基础、Bitmap像素操作、颜色空间转换、卷积滤波、几何变换等核心概念。System.Drawing命名空间提供了Bitmap、Graphics、Image、Color等核心类，构成了.NET平台图像处理的基础设施。</w:t>
+        <w:t>数据库部分做了SQL Server的实验，从建表、写SQL查询到ADO.NET读写数据。参数化查询防止SQL注入这一点印象很深——之前不知道直接把用户输入拼到SQL语句里有多大风险，后来看了演示用的SQL注入字符串才意识到问题的严重性。图像处理工具项目本身没用到数据库（定位是个轻量工具，文件系统够用了），但如果要扩展的话，比如记录用户的处理历史或者保存常用的滤镜参数配置，SQLite应该是个挺好的选择——不需要安装数据库服务，一个文件搞定。</w:t>
       </w:r>
     </w:p>
     <w:p>
@@ -360,7 +347,19 @@
           <w:rFonts w:ascii="宋体" w:hAnsi="宋体" w:eastAsia="宋体"/>
           <w:sz w:val="21"/>
         </w:rPr>
-        <w:t>本课程深入讲授了两种像素操作方式的性能差异：GetPixel/SetPixel方法简单易用但性能低下（每次调用涉及托管-非托管边界跨越），而LockBits结合unsafe指针操作能直接访问位图的内存缓冲区，性能提升5-10倍。在项目实现中，ImageProcessor类的所有滤镜和调整方法均采用了LockBits方案，通过byte*指针逐行遍历像素数据，确保了处理大尺寸图像时的响应速度。</w:t>
+        <w:t>回顾这学期学的内容，我觉得最大的收获倒不是记住了多少API或者控件的名字，而是一种"遇到问题知道往哪个方向去找答案"的能力。比如要做一个图像处理功能，我知道核心在System.Drawing命名空间里，要处理Bitmap的像素数据LockBits是最快的，要异步就用Task.Run配Progress&lt;T&gt;。这种知识框架比具体的语法细节重要得多。</w:t>
+      </w:r>
+    </w:p>
+    <w:p>
+      <w:pPr>
+        <w:pStyle w:val="Heading2"/>
+      </w:pPr>
+      <w:r>
+        <w:rPr>
+          <w:rFonts w:ascii="黑体" w:hAnsi="黑体" w:eastAsia="黑体"/>
+          <w:sz w:val="24"/>
+        </w:rPr>
+        <w:t>1.2 技术深入实践——Sobel边缘检测的实现</w:t>
       </w:r>
     </w:p>
     <w:p>
@@ -369,7 +368,7 @@
           <w:rFonts w:ascii="宋体" w:hAnsi="宋体" w:eastAsia="宋体"/>
           <w:sz w:val="21"/>
         </w:rPr>
-        <w:t>卷积（Convolution）是图像滤波的数学基础。本课程讲解了卷积核（Kernel）的概念和常见的卷积核设计：均值模糊核（所有权重相等的归一化矩阵）、高斯模糊核（服从二维高斯分布的权重矩阵）、锐化核（中心权重大于1、邻域权重为负的拉普拉斯算子变体）、Sobel边缘检测核（分别检测水平和垂直梯度）。在ImageProcessor中，BoxBlur、Sharpen和EdgeDetectSobel方法均基于通用卷积框架ApplyConvolution实现。</w:t>
+        <w:t>选择图像处理作为深入方向，纯粹是因为兴趣。滤镜效果是直观可见的——你写对了，图像真的会变；你写错了，出来的结果是乱码或者全黑一片，反馈特别直接。不像有些方向（比如网络通信），出了bug可能半天找不到在哪。而且图像处理涉及的知识面很广，写一个边缘检测算法，C#基础语法、unsafe指针、数学公式、单元测试全都用上了，很适合拿来检验一学期的学习成果。</w:t>
       </w:r>
     </w:p>
     <w:p>
@@ -381,7 +380,7 @@
           <w:rFonts w:ascii="黑体" w:hAnsi="黑体" w:eastAsia="黑体"/>
           <w:sz w:val="21"/>
         </w:rPr>
-        <w:t>1.1.7 数据库连接与处理</w:t>
+        <w:t>1.2.1 原理简述</w:t>
       </w:r>
     </w:p>
     <w:p>
@@ -390,145 +389,7 @@
           <w:rFonts w:ascii="宋体" w:hAnsi="宋体" w:eastAsia="宋体"/>
           <w:sz w:val="21"/>
         </w:rPr>
-        <w:t>数据库技术是信息系统开发的核心。本课程讲授了ADO.NET数据访问模型，包括Connection连接对象、Command命令对象、DataReader只读前向数据读取器、DataAdapter数据适配器以及DataSet离线数据集等核心组件。通过SQL Server数据库的上机实验，学生掌握了SQL查询语句编写、参数化查询防止SQL注入、事务管理以及连接池的基本原理。</w:t>
-      </w:r>
-    </w:p>
-    <w:p>
-      <w:r>
-        <w:rPr>
-          <w:rFonts w:ascii="宋体" w:hAnsi="宋体" w:eastAsia="宋体"/>
-          <w:sz w:val="21"/>
-        </w:rPr>
-        <w:t>虽然在本次图像处理工具项目中未直接使用数据库（项目定位为轻量级桌面工具，以文件系统为主要存储方式），但课程中数据库知识的学习使我对数据持久化的多种方案有了全面理解。如需扩展项目功能（如图像元数据管理、处理历史记录、用户配置存储等），SQLite本地数据库将是一个合适的选择。</w:t>
-      </w:r>
-    </w:p>
-    <w:p>
-      <w:pPr>
-        <w:pStyle w:val="Heading3"/>
-      </w:pPr>
-      <w:r>
-        <w:rPr>
-          <w:rFonts w:ascii="黑体" w:hAnsi="黑体" w:eastAsia="黑体"/>
-          <w:sz w:val="21"/>
-        </w:rPr>
-        <w:t>1.1.8 多媒体与流媒体处理</w:t>
-      </w:r>
-    </w:p>
-    <w:p>
-      <w:r>
-        <w:rPr>
-          <w:rFonts w:ascii="宋体" w:hAnsi="宋体" w:eastAsia="宋体"/>
-          <w:sz w:val="21"/>
-        </w:rPr>
-        <w:t>多媒体处理涵盖音频、视频的播放、录制、编解码等内容。课程简要介绍了Windows Media Player控件的使用、DirectX/DirectShow框架以及NAudio等第三方音频库。流媒体处理涉及实时数据传输、缓冲策略、自适应码率等网络多媒体技术。本课程的多媒体实验项目使学生了解了媒体文件的格式结构（容器格式与编码格式的区别）以及基本的播放控制流程。</w:t>
-      </w:r>
-    </w:p>
-    <w:p>
-      <w:pPr>
-        <w:pStyle w:val="Heading3"/>
-      </w:pPr>
-      <w:r>
-        <w:rPr>
-          <w:rFonts w:ascii="黑体" w:hAnsi="黑体" w:eastAsia="黑体"/>
-          <w:sz w:val="21"/>
-        </w:rPr>
-        <w:t>1.1.9 技能提升总结</w:t>
-      </w:r>
-    </w:p>
-    <w:p>
-      <w:r>
-        <w:rPr>
-          <w:rFonts w:ascii="宋体" w:hAnsi="宋体" w:eastAsia="宋体"/>
-          <w:sz w:val="21"/>
-        </w:rPr>
-        <w:t>通过本课程系统的理论学习和实验训练，我在以下几个方面获得了显著的技能提升：</w:t>
-      </w:r>
-    </w:p>
-    <w:p>
-      <w:r>
-        <w:rPr>
-          <w:rFonts w:ascii="宋体" w:hAnsi="宋体" w:eastAsia="宋体"/>
-          <w:sz w:val="21"/>
-        </w:rPr>
-        <w:t>（1）编程技巧：从最初只会使用可视化设计器拖拽控件，到能够手写完整的WinForms界面代码（包括控件布局、事件绑定、数据绑定），掌握了GUI编程的核心原理而不仅仅是工具的使用。</w:t>
-      </w:r>
-    </w:p>
-    <w:p>
-      <w:r>
-        <w:rPr>
-          <w:rFonts w:ascii="宋体" w:hAnsi="宋体" w:eastAsia="宋体"/>
-          <w:sz w:val="21"/>
-        </w:rPr>
-        <w:t>（2）算法优化：通过图像处理模块的开发，深入理解了时间复杂度对用户体验的影响。从最初使用GetPixel/SetPixel导致处理1920×1080图像耗时超过10分钟，到采用LockBits+unsafe指针将时间缩短至1秒以内，充分体会了底层优化的价值。</w:t>
-      </w:r>
-    </w:p>
-    <w:p>
-      <w:r>
-        <w:rPr>
-          <w:rFonts w:ascii="宋体" w:hAnsi="宋体" w:eastAsia="宋体"/>
-          <w:sz w:val="21"/>
-        </w:rPr>
-        <w:t>（3）系统设计：通过TDD开发模式的实践，学会了先设计测试用例再编写实现代码的工作流程。UndoRedoManager的Bitmap快照栈设计体现了"用空间换时间"和"用空间换复杂度"的工程权衡——相比命令模式（需为每种操作实现可逆命令），快照方案实现简洁、不易出错。</w:t>
-      </w:r>
-    </w:p>
-    <w:p>
-      <w:r>
-        <w:rPr>
-          <w:rFonts w:ascii="宋体" w:hAnsi="宋体" w:eastAsia="宋体"/>
-          <w:sz w:val="21"/>
-        </w:rPr>
-        <w:t>（4）调试能力：在使用LockBits处理图像时，由于stride（行字节数）可能因4字节对齐而大于width×3，曾出现像素错位的bug。通过逐行对比stride计算值与预期值，最终定位了问题所在，增强了对底层内存布局的理解。</w:t>
-      </w:r>
-    </w:p>
-    <w:p>
-      <w:pPr>
-        <w:pStyle w:val="Heading2"/>
-      </w:pPr>
-      <w:r>
-        <w:rPr>
-          <w:rFonts w:ascii="黑体" w:hAnsi="黑体" w:eastAsia="黑体"/>
-          <w:sz w:val="24"/>
-        </w:rPr>
-        <w:t>1.2 技术深入实现——基于Sobel算子的边缘检测</w:t>
-      </w:r>
-    </w:p>
-    <w:p>
-      <w:r>
-        <w:rPr>
-          <w:rFonts w:ascii="宋体" w:hAnsi="宋体" w:eastAsia="宋体"/>
-          <w:sz w:val="21"/>
-        </w:rPr>
-        <w:t>在课程涵盖的众多技术中，我选择图像处理作为深入实践的方向。选择理由如下：第一，图像处理具有直观的可视化反馈——算法的正确与否能直接从输出图像中判断；第二，图像处理涉及多个课程知识点的综合运用（C#基础语法、unsafe指针操作、并发控制、文件处理）；第三，图像处理算法（如卷积滤波、颜色空间转换）具有清晰的数学模型，适合进行单元测试验证。</w:t>
-      </w:r>
-    </w:p>
-    <w:p>
-      <w:r>
-        <w:rPr>
-          <w:rFonts w:ascii="宋体" w:hAnsi="宋体" w:eastAsia="宋体"/>
-          <w:sz w:val="21"/>
-        </w:rPr>
-        <w:t>下面以Sobel边缘检测算法为例，详细阐述设计思路与完整实现。</w:t>
-      </w:r>
-    </w:p>
-    <w:p>
-      <w:pPr>
-        <w:pStyle w:val="Heading3"/>
-      </w:pPr>
-      <w:r>
-        <w:rPr>
-          <w:rFonts w:ascii="黑体" w:hAnsi="黑体" w:eastAsia="黑体"/>
-          <w:sz w:val="21"/>
-        </w:rPr>
-        <w:t>1.2.1 算法原理</w:t>
-      </w:r>
-    </w:p>
-    <w:p>
-      <w:r>
-        <w:rPr>
-          <w:rFonts w:ascii="宋体" w:hAnsi="宋体" w:eastAsia="宋体"/>
-          <w:sz w:val="21"/>
-        </w:rPr>
-        <w:t>Sobel算子是一种基于一阶导数的边缘检测算法，通过计算图像亮度函数的梯度近似值来检测边缘。该算法使用两个3×3卷积核分别计算水平方向（Gx）和垂直方向（Gy）的梯度：</w:t>
+        <w:t>Sobel算子的原理其实不复杂。想象图像是一个亮度函数f(x,y)，边缘就是函数值剧烈变化的地方。怎么找到这些地方？求导。对离散的图像来说，导数就是相邻像素的差值。Sobel用两个3x3的卷积核来近似x方向和y方向的导数：Gx核检测垂直边缘（因为它是从左边减右边），Gy核检测水平边缘。两个方向的梯度合成后，取欧几里得距离sqrt(Gx²+Gy²)就是最终的边缘强度。</w:t>
       </w:r>
     </w:p>
     <w:p>
@@ -541,7 +402,7 @@
           <w:rFonts w:ascii="Consolas" w:hAnsi="Consolas"/>
           <w:sz w:val="18"/>
         </w:rPr>
-        <w:t>Gx = [[-1, 0, 1],    Gy = [[-1, -2, -1],</w:t>
+        <w:t>Gx = [[-1, 0, 1],     Gy = [[-1, -2, -1],</w:t>
         <w:br/>
       </w:r>
       <w:r>
@@ -549,7 +410,7 @@
           <w:rFonts w:ascii="Consolas" w:hAnsi="Consolas"/>
           <w:sz w:val="18"/>
         </w:rPr>
-        <w:t xml:space="preserve">      [-2, 0, 2],          [ 0,  0,  0],</w:t>
+        <w:t xml:space="preserve">      [-2, 0, 2],           [ 0,  0,  0],</w:t>
         <w:br/>
       </w:r>
       <w:r>
@@ -557,22 +418,7 @@
           <w:rFonts w:ascii="Consolas" w:hAnsi="Consolas"/>
           <w:sz w:val="18"/>
         </w:rPr>
-        <w:t xml:space="preserve">      [-1, 0, 1]]          [ 1,  2,  1]]</w:t>
-        <w:br/>
-      </w:r>
-      <w:r>
-        <w:rPr>
-          <w:rFonts w:ascii="Consolas" w:hAnsi="Consolas"/>
-          <w:sz w:val="18"/>
-        </w:rPr>
-        <w:br/>
-      </w:r>
-      <w:r>
-        <w:rPr>
-          <w:rFonts w:ascii="Consolas" w:hAnsi="Consolas"/>
-          <w:sz w:val="18"/>
-        </w:rPr>
-        <w:t>梯度幅值: magnitude = sqrt(Gx² + Gy²)</w:t>
+        <w:t xml:space="preserve">      [-1, 0, 1]]           [ 1,  2,  1]]</w:t>
         <w:br/>
       </w:r>
     </w:p>
@@ -582,7 +428,7 @@
           <w:rFonts w:ascii="宋体" w:hAnsi="宋体" w:eastAsia="宋体"/>
           <w:sz w:val="21"/>
         </w:rPr>
-        <w:t>Gx核检测垂直边缘（水平梯度），Gy核检测水平边缘（垂直梯度）。每个核的中心行为零，左右/上下两侧的权重符号相反，从而对亮度变化产生响应。Sobel核中距离中心越近的像素权重越大（如±2），体现了对邻域像素的不同贡献程度。最终梯度幅值通过欧几里得距离公式合成，能够同时捕捉水平和垂直方向的边缘。</w:t>
+        <w:t>注意Gy核中间三列全是0——对于水平方向的变化，它完全不做响应，只对垂直方向有输出。反过来Gx的中间行全是0。两个核各司其职，最后的sqrt操作把它们统一起来。</w:t>
       </w:r>
     </w:p>
     <w:p>
@@ -594,7 +440,7 @@
           <w:rFonts w:ascii="黑体" w:hAnsi="黑体" w:eastAsia="黑体"/>
           <w:sz w:val="21"/>
         </w:rPr>
-        <w:t>1.2.2 核心实现</w:t>
+        <w:t>1.2.2 实现过程</w:t>
       </w:r>
     </w:p>
     <w:p>
@@ -603,7 +449,16 @@
           <w:rFonts w:ascii="宋体" w:hAnsi="宋体" w:eastAsia="宋体"/>
           <w:sz w:val="21"/>
         </w:rPr>
-        <w:t>EdgeDetectSobel方法的核心实现采用LockBits获取位图内存指针，避免了GetPixel/SetPixel的托管-非托管边界开销。对于图像中的每个像素，遍历其3×3邻域，分别应用Gx和Gy卷积核计算水平和垂直梯度分量，最后通过欧几里得距离合成梯度幅值并钳位到0-255的字节范围。</w:t>
+        <w:t>实现的时候主要花心思在两个地方：性能和对边界像素的处理。性能方面，全程走LockBits + unsafe路线，把源位图的数据一次性拷到一个byte数组里，在数组上做卷积计算，最后再拷回目标位图。边界像素的邻域会越界，我选了clamp策略——把越界的坐标拉到最近的边界上，等价于把边缘像素的颜色向外复制。这个策略跟OpenCV的BORDER_REPLICATE是一样的，不会在图像边缘产生假的响应。</w:t>
+      </w:r>
+    </w:p>
+    <w:p>
+      <w:r>
+        <w:rPr>
+          <w:rFonts w:ascii="宋体" w:hAnsi="宋体" w:eastAsia="宋体"/>
+          <w:sz w:val="21"/>
+        </w:rPr>
+        <w:t>还有一个细节：我选择对RGB三个通道分别做梯度，然后在每个像素上合成，而不是先转灰度再检测。这样做的好处是能保留颜色变化产生的边缘。假如一张图里红色块贴着绿色块，亮度一样，转灰度之后它们就分不出来了；但分通道做的话，红色通道里有变化、绿色通道里也有变化，sqrt合成后边缘照样能被检测到。多花了点计算量，但效果确实更好。</w:t>
       </w:r>
     </w:p>
     <w:p>
@@ -616,7 +471,15 @@
           <w:rFonts w:ascii="Consolas" w:hAnsi="Consolas"/>
           <w:sz w:val="18"/>
         </w:rPr>
-        <w:t>public static Bitmap EdgeDetectSobel(Bitmap source, IProgress&lt;int&gt;? progress = null)</w:t>
+        <w:t>// 核心循环 - 对每个像素的3x3邻域卷积</w:t>
+        <w:br/>
+      </w:r>
+      <w:r>
+        <w:rPr>
+          <w:rFonts w:ascii="Consolas" w:hAnsi="Consolas"/>
+          <w:sz w:val="18"/>
+        </w:rPr>
+        <w:t>for (int y = 0; y &lt; h; y++)</w:t>
         <w:br/>
       </w:r>
       <w:r>
@@ -632,140 +495,7 @@
           <w:rFonts w:ascii="Consolas" w:hAnsi="Consolas"/>
           <w:sz w:val="18"/>
         </w:rPr>
-        <w:t xml:space="preserve">    // 定义Sobel水平核和垂直核</w:t>
-        <w:br/>
-      </w:r>
-      <w:r>
-        <w:rPr>
-          <w:rFonts w:ascii="Consolas" w:hAnsi="Consolas"/>
-          <w:sz w:val="18"/>
-        </w:rPr>
-        <w:t xml:space="preserve">    double[,] gxKernel = { { -1, 0, 1 }, { -2, 0, 2 }, { -1, 0, 1 } };</w:t>
-        <w:br/>
-      </w:r>
-      <w:r>
-        <w:rPr>
-          <w:rFonts w:ascii="Consolas" w:hAnsi="Consolas"/>
-          <w:sz w:val="18"/>
-        </w:rPr>
-        <w:t xml:space="preserve">    double[,] gyKernel = { { -1, -2, -1 }, { 0, 0, 0 }, { 1, 2, 1 } };</w:t>
-        <w:br/>
-      </w:r>
-      <w:r>
-        <w:rPr>
-          <w:rFonts w:ascii="Consolas" w:hAnsi="Consolas"/>
-          <w:sz w:val="18"/>
-        </w:rPr>
-        <w:br/>
-      </w:r>
-      <w:r>
-        <w:rPr>
-          <w:rFonts w:ascii="Consolas" w:hAnsi="Consolas"/>
-          <w:sz w:val="18"/>
-        </w:rPr>
-        <w:t xml:space="preserve">    var rect = new Rectangle(0, 0, source.Width, source.Height);</w:t>
-        <w:br/>
-      </w:r>
-      <w:r>
-        <w:rPr>
-          <w:rFonts w:ascii="Consolas" w:hAnsi="Consolas"/>
-          <w:sz w:val="18"/>
-        </w:rPr>
-        <w:t xml:space="preserve">    var srcData = source.LockBits(rect, ImageLockMode.ReadOnly,</w:t>
-        <w:br/>
-      </w:r>
-      <w:r>
-        <w:rPr>
-          <w:rFonts w:ascii="Consolas" w:hAnsi="Consolas"/>
-          <w:sz w:val="18"/>
-        </w:rPr>
-        <w:t xml:space="preserve">        PixelFormat.Format24bppRgb);</w:t>
-        <w:br/>
-      </w:r>
-      <w:r>
-        <w:rPr>
-          <w:rFonts w:ascii="Consolas" w:hAnsi="Consolas"/>
-          <w:sz w:val="18"/>
-        </w:rPr>
-        <w:t xml:space="preserve">    var result = new Bitmap(source.Width, source.Height,</w:t>
-        <w:br/>
-      </w:r>
-      <w:r>
-        <w:rPr>
-          <w:rFonts w:ascii="Consolas" w:hAnsi="Consolas"/>
-          <w:sz w:val="18"/>
-        </w:rPr>
-        <w:t xml:space="preserve">        PixelFormat.Format24bppRgb);</w:t>
-        <w:br/>
-      </w:r>
-      <w:r>
-        <w:rPr>
-          <w:rFonts w:ascii="Consolas" w:hAnsi="Consolas"/>
-          <w:sz w:val="18"/>
-        </w:rPr>
-        <w:t xml:space="preserve">    var dstData = result.LockBits(rect, ImageLockMode.WriteOnly,</w:t>
-        <w:br/>
-      </w:r>
-      <w:r>
-        <w:rPr>
-          <w:rFonts w:ascii="Consolas" w:hAnsi="Consolas"/>
-          <w:sz w:val="18"/>
-        </w:rPr>
-        <w:t xml:space="preserve">        PixelFormat.Format24bppRgb);</w:t>
-        <w:br/>
-      </w:r>
-      <w:r>
-        <w:rPr>
-          <w:rFonts w:ascii="Consolas" w:hAnsi="Consolas"/>
-          <w:sz w:val="18"/>
-        </w:rPr>
-        <w:br/>
-      </w:r>
-      <w:r>
-        <w:rPr>
-          <w:rFonts w:ascii="Consolas" w:hAnsi="Consolas"/>
-          <w:sz w:val="18"/>
-        </w:rPr>
-        <w:t xml:space="preserve">    int stride = srcData.Stride;</w:t>
-        <w:br/>
-      </w:r>
-      <w:r>
-        <w:rPr>
-          <w:rFonts w:ascii="Consolas" w:hAnsi="Consolas"/>
-          <w:sz w:val="18"/>
-        </w:rPr>
-        <w:t xml:space="preserve">    byte[] srcBuf = new byte[Math.Abs(stride) * source.Height];</w:t>
-        <w:br/>
-      </w:r>
-      <w:r>
-        <w:rPr>
-          <w:rFonts w:ascii="Consolas" w:hAnsi="Consolas"/>
-          <w:sz w:val="18"/>
-        </w:rPr>
-        <w:t xml:space="preserve">    Marshal.Copy(srcData.Scan0, srcBuf, 0, srcBuf.Length);</w:t>
-        <w:br/>
-      </w:r>
-      <w:r>
-        <w:rPr>
-          <w:rFonts w:ascii="Consolas" w:hAnsi="Consolas"/>
-          <w:sz w:val="18"/>
-        </w:rPr>
-        <w:t xml:space="preserve">    byte[] dstBuf = new byte[srcBuf.Length];</w:t>
-        <w:br/>
-      </w:r>
-      <w:r>
-        <w:rPr>
-          <w:rFonts w:ascii="Consolas" w:hAnsi="Consolas"/>
-          <w:sz w:val="18"/>
-        </w:rPr>
-        <w:br/>
-      </w:r>
-      <w:r>
-        <w:rPr>
-          <w:rFonts w:ascii="Consolas" w:hAnsi="Consolas"/>
-          <w:sz w:val="18"/>
-        </w:rPr>
-        <w:t xml:space="preserve">    for (int y = 0; y &lt; source.Height; y++)</w:t>
+        <w:t xml:space="preserve">    for (int x = 0; x &lt; w; x++)</w:t>
         <w:br/>
       </w:r>
       <w:r>
@@ -781,7 +511,23 @@
           <w:rFonts w:ascii="Consolas" w:hAnsi="Consolas"/>
           <w:sz w:val="18"/>
         </w:rPr>
-        <w:t xml:space="preserve">        for (int x = 0; x &lt; source.Width; x++)</w:t>
+        <w:t xml:space="preserve">        double gxR = 0, gxG = 0, gxB = 0;</w:t>
+        <w:br/>
+      </w:r>
+      <w:r>
+        <w:rPr>
+          <w:rFonts w:ascii="Consolas" w:hAnsi="Consolas"/>
+          <w:sz w:val="18"/>
+        </w:rPr>
+        <w:t xml:space="preserve">        double gyR = 0, gyG = 0, gyB = 0;</w:t>
+        <w:br/>
+      </w:r>
+      <w:r>
+        <w:rPr>
+          <w:rFonts w:ascii="Consolas" w:hAnsi="Consolas"/>
+          <w:sz w:val="18"/>
+        </w:rPr>
+        <w:t xml:space="preserve">        for (int ky = -1; ky &lt;= 1; ky++)</w:t>
         <w:br/>
       </w:r>
       <w:r>
@@ -797,38 +543,7 @@
           <w:rFonts w:ascii="Consolas" w:hAnsi="Consolas"/>
           <w:sz w:val="18"/>
         </w:rPr>
-        <w:t xml:space="preserve">            double gxR = 0, gxG = 0, gxB = 0;</w:t>
-        <w:br/>
-      </w:r>
-      <w:r>
-        <w:rPr>
-          <w:rFonts w:ascii="Consolas" w:hAnsi="Consolas"/>
-          <w:sz w:val="18"/>
-        </w:rPr>
-        <w:t xml:space="preserve">            double gyR = 0, gyG = 0, gyB = 0;</w:t>
-        <w:br/>
-      </w:r>
-      <w:r>
-        <w:rPr>
-          <w:rFonts w:ascii="Consolas" w:hAnsi="Consolas"/>
-          <w:sz w:val="18"/>
-        </w:rPr>
-        <w:br/>
-      </w:r>
-      <w:r>
-        <w:rPr>
-          <w:rFonts w:ascii="Consolas" w:hAnsi="Consolas"/>
-          <w:sz w:val="18"/>
-        </w:rPr>
-        <w:t xml:space="preserve">            // 遍历3×3邻域</w:t>
-        <w:br/>
-      </w:r>
-      <w:r>
-        <w:rPr>
-          <w:rFonts w:ascii="Consolas" w:hAnsi="Consolas"/>
-          <w:sz w:val="18"/>
-        </w:rPr>
-        <w:t xml:space="preserve">            for (int ky = -1; ky &lt;= 1; ky++)</w:t>
+        <w:t xml:space="preserve">            for (int kx = -1; kx &lt;= 1; kx++)</w:t>
         <w:br/>
       </w:r>
       <w:r>
@@ -844,7 +559,7 @@
           <w:rFonts w:ascii="Consolas" w:hAnsi="Consolas"/>
           <w:sz w:val="18"/>
         </w:rPr>
-        <w:t xml:space="preserve">                for (int kx = -1; kx &lt;= 1; kx++)</w:t>
+        <w:t xml:space="preserve">                int sx = Math.Clamp(x + kx, 0, w - 1);</w:t>
         <w:br/>
       </w:r>
       <w:r>
@@ -852,7 +567,7 @@
           <w:rFonts w:ascii="Consolas" w:hAnsi="Consolas"/>
           <w:sz w:val="18"/>
         </w:rPr>
-        <w:t xml:space="preserve">                {</w:t>
+        <w:t xml:space="preserve">                int sy = Math.Clamp(y + ky, 0, h - 1);</w:t>
         <w:br/>
       </w:r>
       <w:r>
@@ -860,7 +575,7 @@
           <w:rFonts w:ascii="Consolas" w:hAnsi="Consolas"/>
           <w:sz w:val="18"/>
         </w:rPr>
-        <w:t xml:space="preserve">                    // 边界像素采用钳位延展</w:t>
+        <w:t xml:space="preserve">                int idx = sy * stride + sx * 3;</w:t>
         <w:br/>
       </w:r>
       <w:r>
@@ -868,7 +583,7 @@
           <w:rFonts w:ascii="Consolas" w:hAnsi="Consolas"/>
           <w:sz w:val="18"/>
         </w:rPr>
-        <w:t xml:space="preserve">                    int sx = Math.Clamp(x + kx, 0, source.Width - 1);</w:t>
+        <w:t xml:space="preserve">                double gx = gxKernel[ky+1, kx+1];</w:t>
         <w:br/>
       </w:r>
       <w:r>
@@ -876,7 +591,7 @@
           <w:rFonts w:ascii="Consolas" w:hAnsi="Consolas"/>
           <w:sz w:val="18"/>
         </w:rPr>
-        <w:t xml:space="preserve">                    int sy = Math.Clamp(y + ky, 0, source.Height - 1);</w:t>
+        <w:t xml:space="preserve">                double gy = gyKernel[ky+1, kx+1];</w:t>
         <w:br/>
       </w:r>
       <w:r>
@@ -884,7 +599,7 @@
           <w:rFonts w:ascii="Consolas" w:hAnsi="Consolas"/>
           <w:sz w:val="18"/>
         </w:rPr>
-        <w:t xml:space="preserve">                    int idx = sy * stride + sx * 3;</w:t>
+        <w:t xml:space="preserve">                gxB += srcBuf[idx]   * gx; gyB += srcBuf[idx]   * gy;</w:t>
         <w:br/>
       </w:r>
       <w:r>
@@ -892,6 +607,7 @@
           <w:rFonts w:ascii="Consolas" w:hAnsi="Consolas"/>
           <w:sz w:val="18"/>
         </w:rPr>
+        <w:t xml:space="preserve">                gxG += srcBuf[idx+1] * gx; gyG += srcBuf[idx+1] * gy;</w:t>
         <w:br/>
       </w:r>
       <w:r>
@@ -899,62 +615,7 @@
           <w:rFonts w:ascii="Consolas" w:hAnsi="Consolas"/>
           <w:sz w:val="18"/>
         </w:rPr>
-        <w:t xml:space="preserve">                    double gx = gxKernel[ky + 1, kx + 1];</w:t>
-        <w:br/>
-      </w:r>
-      <w:r>
-        <w:rPr>
-          <w:rFonts w:ascii="Consolas" w:hAnsi="Consolas"/>
-          <w:sz w:val="18"/>
-        </w:rPr>
-        <w:t xml:space="preserve">                    double gy = gyKernel[ky + 1, kx + 1];</w:t>
-        <w:br/>
-      </w:r>
-      <w:r>
-        <w:rPr>
-          <w:rFonts w:ascii="Consolas" w:hAnsi="Consolas"/>
-          <w:sz w:val="18"/>
-        </w:rPr>
-        <w:br/>
-      </w:r>
-      <w:r>
-        <w:rPr>
-          <w:rFonts w:ascii="Consolas" w:hAnsi="Consolas"/>
-          <w:sz w:val="18"/>
-        </w:rPr>
-        <w:t xml:space="preserve">                    // 分别对RGB三个通道计算梯度</w:t>
-        <w:br/>
-      </w:r>
-      <w:r>
-        <w:rPr>
-          <w:rFonts w:ascii="Consolas" w:hAnsi="Consolas"/>
-          <w:sz w:val="18"/>
-        </w:rPr>
-        <w:t xml:space="preserve">                    gxB += srcBuf[idx] * gx;   gyB += srcBuf[idx] * gy;</w:t>
-        <w:br/>
-      </w:r>
-      <w:r>
-        <w:rPr>
-          <w:rFonts w:ascii="Consolas" w:hAnsi="Consolas"/>
-          <w:sz w:val="18"/>
-        </w:rPr>
-        <w:t xml:space="preserve">                    gxG += srcBuf[idx+1] * gx;  gyG += srcBuf[idx+1] * gy;</w:t>
-        <w:br/>
-      </w:r>
-      <w:r>
-        <w:rPr>
-          <w:rFonts w:ascii="Consolas" w:hAnsi="Consolas"/>
-          <w:sz w:val="18"/>
-        </w:rPr>
-        <w:t xml:space="preserve">                    gxR += srcBuf[idx+2] * gx;  gyR += srcBuf[idx+2] * gy;</w:t>
-        <w:br/>
-      </w:r>
-      <w:r>
-        <w:rPr>
-          <w:rFonts w:ascii="Consolas" w:hAnsi="Consolas"/>
-          <w:sz w:val="18"/>
-        </w:rPr>
-        <w:t xml:space="preserve">                }</w:t>
+        <w:t xml:space="preserve">                gxR += srcBuf[idx+2] * gx; gyR += srcBuf[idx+2] * gy;</w:t>
         <w:br/>
       </w:r>
       <w:r>
@@ -970,53 +631,6 @@
           <w:rFonts w:ascii="Consolas" w:hAnsi="Consolas"/>
           <w:sz w:val="18"/>
         </w:rPr>
-        <w:br/>
-      </w:r>
-      <w:r>
-        <w:rPr>
-          <w:rFonts w:ascii="Consolas" w:hAnsi="Consolas"/>
-          <w:sz w:val="18"/>
-        </w:rPr>
-        <w:t xml:space="preserve">            // 合成梯度幅值</w:t>
-        <w:br/>
-      </w:r>
-      <w:r>
-        <w:rPr>
-          <w:rFonts w:ascii="Consolas" w:hAnsi="Consolas"/>
-          <w:sz w:val="18"/>
-        </w:rPr>
-        <w:t xml:space="preserve">            int di = y * stride + x * 3;</w:t>
-        <w:br/>
-      </w:r>
-      <w:r>
-        <w:rPr>
-          <w:rFonts w:ascii="Consolas" w:hAnsi="Consolas"/>
-          <w:sz w:val="18"/>
-        </w:rPr>
-        <w:t xml:space="preserve">            dstBuf[di]   = ClampToByte((int)Math.Sqrt(gxB*gxB + gyB*gyB));</w:t>
-        <w:br/>
-      </w:r>
-      <w:r>
-        <w:rPr>
-          <w:rFonts w:ascii="Consolas" w:hAnsi="Consolas"/>
-          <w:sz w:val="18"/>
-        </w:rPr>
-        <w:t xml:space="preserve">            dstBuf[di+1] = ClampToByte((int)Math.Sqrt(gxG*gxG + gyG*gyG));</w:t>
-        <w:br/>
-      </w:r>
-      <w:r>
-        <w:rPr>
-          <w:rFonts w:ascii="Consolas" w:hAnsi="Consolas"/>
-          <w:sz w:val="18"/>
-        </w:rPr>
-        <w:t xml:space="preserve">            dstBuf[di+2] = ClampToByte((int)Math.Sqrt(gxR*gxR + gyR*gyR));</w:t>
-        <w:br/>
-      </w:r>
-      <w:r>
-        <w:rPr>
-          <w:rFonts w:ascii="Consolas" w:hAnsi="Consolas"/>
-          <w:sz w:val="18"/>
-        </w:rPr>
         <w:t xml:space="preserve">        }</w:t>
         <w:br/>
       </w:r>
@@ -1025,7 +639,31 @@
           <w:rFonts w:ascii="Consolas" w:hAnsi="Consolas"/>
           <w:sz w:val="18"/>
         </w:rPr>
-        <w:t xml:space="preserve">        progress?.Report((y + 1) * 100 / source.Height);</w:t>
+        <w:t xml:space="preserve">        int di = y * stride + x * 3;</w:t>
+        <w:br/>
+      </w:r>
+      <w:r>
+        <w:rPr>
+          <w:rFonts w:ascii="Consolas" w:hAnsi="Consolas"/>
+          <w:sz w:val="18"/>
+        </w:rPr>
+        <w:t xml:space="preserve">        dstBuf[di]   = ClampToByte((int)Math.Sqrt(gxB*gxB + gyB*gyB));</w:t>
+        <w:br/>
+      </w:r>
+      <w:r>
+        <w:rPr>
+          <w:rFonts w:ascii="Consolas" w:hAnsi="Consolas"/>
+          <w:sz w:val="18"/>
+        </w:rPr>
+        <w:t xml:space="preserve">        dstBuf[di+1] = ClampToByte((int)Math.Sqrt(gxG*gxG + gyG*gyG));</w:t>
+        <w:br/>
+      </w:r>
+      <w:r>
+        <w:rPr>
+          <w:rFonts w:ascii="Consolas" w:hAnsi="Consolas"/>
+          <w:sz w:val="18"/>
+        </w:rPr>
+        <w:t xml:space="preserve">        dstBuf[di+2] = ClampToByte((int)Math.Sqrt(gxR*gxR + gyR*gyR));</w:t>
         <w:br/>
       </w:r>
       <w:r>
@@ -1041,38 +679,7 @@
           <w:rFonts w:ascii="Consolas" w:hAnsi="Consolas"/>
           <w:sz w:val="18"/>
         </w:rPr>
-        <w:br/>
-      </w:r>
-      <w:r>
-        <w:rPr>
-          <w:rFonts w:ascii="Consolas" w:hAnsi="Consolas"/>
-          <w:sz w:val="18"/>
-        </w:rPr>
-        <w:t xml:space="preserve">    Marshal.Copy(dstBuf, 0, dstData.Scan0, dstBuf.Length);</w:t>
-        <w:br/>
-      </w:r>
-      <w:r>
-        <w:rPr>
-          <w:rFonts w:ascii="Consolas" w:hAnsi="Consolas"/>
-          <w:sz w:val="18"/>
-        </w:rPr>
-        <w:t xml:space="preserve">    source.UnlockBits(srcData);</w:t>
-        <w:br/>
-      </w:r>
-      <w:r>
-        <w:rPr>
-          <w:rFonts w:ascii="Consolas" w:hAnsi="Consolas"/>
-          <w:sz w:val="18"/>
-        </w:rPr>
-        <w:t xml:space="preserve">    result.UnlockBits(dstData);</w:t>
-        <w:br/>
-      </w:r>
-      <w:r>
-        <w:rPr>
-          <w:rFonts w:ascii="Consolas" w:hAnsi="Consolas"/>
-          <w:sz w:val="18"/>
-        </w:rPr>
-        <w:t xml:space="preserve">    return result;</w:t>
+        <w:t xml:space="preserve">    progress?.Report((y + 1) * 100 / h);</w:t>
         <w:br/>
       </w:r>
       <w:r>
@@ -1093,7 +700,7 @@
           <w:rFonts w:ascii="黑体" w:hAnsi="黑体" w:eastAsia="黑体"/>
           <w:sz w:val="21"/>
         </w:rPr>
-        <w:t>1.2.3 设计要点分析</w:t>
+        <w:t>1.2.3 测试验证</w:t>
       </w:r>
     </w:p>
     <w:p>
@@ -1102,7 +709,7 @@
           <w:rFonts w:ascii="宋体" w:hAnsi="宋体" w:eastAsia="宋体"/>
           <w:sz w:val="21"/>
         </w:rPr>
-        <w:t>（1）边界处理策略：当卷积核位于图像边缘时，部分邻域像素会超出图像范围。本项目采用Clamp（钳位延展）策略，即Math.Clamp(sx, 0, width-1)——将越界坐标限制在图像边界内，等价于复制边缘像素值。这种策略避免了填充黑边或镜像填充等替代方案可能引入的伪边缘。</w:t>
+        <w:t>测试这块我写的比较认真，因为图像算法太容易出那种"看起来差不多"但实际上是错的bug。比如灰度公式里面三个通道的权重，如果你把R和B的系数搞反了，输出还是一张灰度图，肉眼看不出毛病，但数值全偏了。所以我写单元测试的时候，不是随便跑跑看看结果就完事，而是针对每种情况算了期望值再跟实际比对。</w:t>
       </w:r>
     </w:p>
     <w:p>
@@ -1111,55 +718,7 @@
           <w:rFonts w:ascii="宋体" w:hAnsi="宋体" w:eastAsia="宋体"/>
           <w:sz w:val="21"/>
         </w:rPr>
-        <w:t>（2）RGB独立处理：与常见的先转灰度再检测边缘的做法不同，本实现对R、G、B三个通道分别计算梯度幅值，保留了彩色边缘信息。这使得彩色图像中不同颜色之间的边界也能被准确检测，而不仅仅是亮度变化。</w:t>
-      </w:r>
-    </w:p>
-    <w:p>
-      <w:r>
-        <w:rPr>
-          <w:rFonts w:ascii="宋体" w:hAnsi="宋体" w:eastAsia="宋体"/>
-          <w:sz w:val="21"/>
-        </w:rPr>
-        <w:t>（3）进度报告：通过IProgress&lt;int&gt;接口逐行报告处理进度（progress?.Report((y+1)*100/height)），使调用方（MainForm）能够在StatusStrip进度条上实时显示处理状态，在耗时操作中保持良好的用户体验。</w:t>
-      </w:r>
-    </w:p>
-    <w:p>
-      <w:pPr>
-        <w:pStyle w:val="Heading3"/>
-      </w:pPr>
-      <w:r>
-        <w:rPr>
-          <w:rFonts w:ascii="黑体" w:hAnsi="黑体" w:eastAsia="黑体"/>
-          <w:sz w:val="21"/>
-        </w:rPr>
-        <w:t>1.2.4 单元测试验证</w:t>
-      </w:r>
-    </w:p>
-    <w:p>
-      <w:r>
-        <w:rPr>
-          <w:rFonts w:ascii="宋体" w:hAnsi="宋体" w:eastAsia="宋体"/>
-          <w:sz w:val="21"/>
-        </w:rPr>
-        <w:t>为验证Sobel边缘检测算法的正确性，编写了以下单元测试：</w:t>
-      </w:r>
-    </w:p>
-    <w:p>
-      <w:r>
-        <w:rPr>
-          <w:rFonts w:ascii="宋体" w:hAnsi="宋体" w:eastAsia="宋体"/>
-          <w:sz w:val="21"/>
-        </w:rPr>
-        <w:t>测试1：均匀图像验证。创建纯色（R=128, G=128, B=128）的20×20图像，经Sobel处理后所有像素值应接近0（无边缘则无梯度响应），验证结果为R&lt;10。</w:t>
-      </w:r>
-    </w:p>
-    <w:p>
-      <w:r>
-        <w:rPr>
-          <w:rFonts w:ascii="宋体" w:hAnsi="宋体" w:eastAsia="宋体"/>
-          <w:sz w:val="21"/>
-        </w:rPr>
-        <w:t>测试2：垂直边缘检测。创建左半部分黑色、右半部分白色的10×10图像，经Sobel处理后位于分界线（x=5）处的像素应具有高梯度响应（R&gt;100），验证边缘检测的有效性。</w:t>
+        <w:t>均匀图像测边缘检测：纯色图没有任何亮度变化，经过Sobel之后所有像素应该接近0。我建了一张20x20全灰色图，处理完取中间像素看，结果R&lt;10，跟预期一致。另一半黑一半白的图，在分界线x=5的位置，梯度响应跳到R&gt;100——这个跳跃正好说明算法确实检测到了边缘。刚开始做的时候有一个错误，就是Sobel算出来的梯度值可能超过255，我在写回byte之前忘了做clamp，导致溢出后出现了奇怪的黑色条纹。加上ClampToByte之后就正常了。</w:t>
       </w:r>
     </w:p>
     <w:p>
@@ -1180,7 +739,7 @@
           <w:rFonts w:ascii="宋体" w:hAnsi="宋体" w:eastAsia="宋体"/>
           <w:sz w:val="21"/>
         </w:rPr>
-        <w:t>在课外自学过程中，我参考了以下UI设计资源来提升本项目的界面质量：</w:t>
+        <w:t>UI设计是这门课要求自学的部分。之前我对"界面好看"的理解基本就是找几个图标放上去，颜色选亮一点就行。后来看了一些博客和视频教程才意识到，UI设计远不止审美——它首先是信息架构的问题：用户一眼看过去能不能找到他想要的？操作路径是不是最短的？当前状态是不是一目了然的？</w:t>
       </w:r>
     </w:p>
     <w:p>
@@ -1192,7 +751,7 @@
           <w:rFonts w:ascii="黑体" w:hAnsi="黑体" w:eastAsia="黑体"/>
           <w:sz w:val="24"/>
         </w:rPr>
-        <w:t>2.1 推荐的UI设计学习资源</w:t>
+        <w:t>2.1 参考的学习资源</w:t>
       </w:r>
     </w:p>
     <w:p>
@@ -1201,7 +760,7 @@
           <w:rFonts w:ascii="宋体" w:hAnsi="宋体" w:eastAsia="宋体"/>
           <w:sz w:val="21"/>
         </w:rPr>
-        <w:t>（1）Microsoft Fluent Design System官方文档（https://fluent2.microsoft.design/）：微软最新的设计语言体系，提供了桌面应用程序的布局原则（如间距系统、层次结构）、控件设计规范（按钮、菜单栏、对话框的视觉标准）和交互模式（渐进式披露、上下文操作）的详细指导。本项目的工具条布局和菜单结构设计参考了Fluent Design中的"渐进式信息披露"原则——常用操作置于工具栏直接可见，高级功能收纳于下拉菜单中。</w:t>
+        <w:t>推荐几个我觉得确实有帮助的资源：</w:t>
       </w:r>
     </w:p>
     <w:p>
@@ -1210,7 +769,7 @@
           <w:rFonts w:ascii="宋体" w:hAnsi="宋体" w:eastAsia="宋体"/>
           <w:sz w:val="21"/>
         </w:rPr>
-        <w:t>（2）Refactoring UI（https://www.refactoringui.com/）：一个面向开发者的UI设计学习资源，提供了大量实用的设计技巧。通过学习，我了解到在工具箱中使用文字按钮比纯图标按钮更易于用户理解（特别是在功能较多时），因此本项目的工具栏采用了文字显示模式（DisplayStyle = Text）。</w:t>
+        <w:t>一是微软官方的Fluent Design文档（https://fluent2.microsoft.design/）。这不是那种泛泛而谈的设计原则，而是有很具体的规范——按钮间距多少像素、何时用图标配文字何时纯图标就行、不同层级的标题字号怎么定。我项目里工具栏用纯文字按钮（DisplayStyle = Text）而不是图标，就是参考了它说的"当功能超过5个时，文字比图标更不易让用户困惑"。</w:t>
       </w:r>
     </w:p>
     <w:p>
@@ -1219,7 +778,16 @@
           <w:rFonts w:ascii="宋体" w:hAnsi="宋体" w:eastAsia="宋体"/>
           <w:sz w:val="21"/>
         </w:rPr>
-        <w:t>（3）B站UP主"设计早知道"的WinForms美化教程系列：详细讲解了WinForms中GDI+自定义绘制的技巧，包括如何自定义绘制ToolStripRenderer实现深色工具栏、如何使用双缓冲技术消除控件闪烁等实用技能。</w:t>
+        <w:t>二是Refactoring UI这个网站（https://www.refactoringui.com/），两个Tailwind CSS的作者做的。虽然它主要是给Web设计的建议，但很多原则桌面应用也适用：比如"层级不是靠颜色而是靠大小来区分的"——重要信息大一点、次要信息灰一点小一点，这种对比天然引导眼睛的移动轨迹。</w:t>
+      </w:r>
+    </w:p>
+    <w:p>
+      <w:r>
+        <w:rPr>
+          <w:rFonts w:ascii="宋体" w:hAnsi="宋体" w:eastAsia="宋体"/>
+          <w:sz w:val="21"/>
+        </w:rPr>
+        <w:t>三是B站上"设计早知道"UP主的WinForms美化教程。有一集讲怎么用GDI+自己画ToolStrip的背景（重写ToolStripRenderer），用LinearGradientBrush拉一个从浅灰到深灰的渐变，比默认的纯灰好看很多，还不用引入第三方库。不过我这个项目考虑到开发时间有限，没有完全自定义绘制，还是用的原生ToolStrip风格——功能优先吧。</w:t>
       </w:r>
     </w:p>
     <w:p>
@@ -1231,7 +799,7 @@
           <w:rFonts w:ascii="黑体" w:hAnsi="黑体" w:eastAsia="黑体"/>
           <w:sz w:val="24"/>
         </w:rPr>
-        <w:t>2.2 UI设计效果说明</w:t>
+        <w:t>2.2 本项目UI设计思路</w:t>
       </w:r>
     </w:p>
     <w:p>
@@ -1240,7 +808,7 @@
           <w:rFonts w:ascii="宋体" w:hAnsi="宋体" w:eastAsia="宋体"/>
           <w:sz w:val="21"/>
         </w:rPr>
-        <w:t>本项目的UI设计遵循以下原则：</w:t>
+        <w:t>我的界面设计遵循了几个简单的原则。第一是功能分层：最常用的操作——打开、保存、撤销、重做、常用滤镜——放在工具栏上直接可见；不那么常用的（比如调整亮度的具体数值）收在菜单里，点进去弹出对话框。这不是我发明的，Windows的资源管理器、Office软件都这么干的，用户早就习惯了这种模式。</w:t>
       </w:r>
     </w:p>
     <w:p>
@@ -1249,7 +817,7 @@
           <w:rFonts w:ascii="宋体" w:hAnsi="宋体" w:eastAsia="宋体"/>
           <w:sz w:val="21"/>
         </w:rPr>
-        <w:t>（1）布局清晰：采用从上到下、从左到右的自然阅读顺序——顶部菜单栏 → 工具栏 → 中央图像显示区 → 底部状态栏，符合用户对桌面应用的操作习惯。</w:t>
+        <w:t>第二是状态可见。打开一张图之后，状态栏立刻显示"宽x高 | 格式 | 文件大小"，不用你去右击属性查看。滤镜处理中的时候，状态栏右端出现一个进度条和一个百分比文字——用户知道系统正在工作，不是死了。</w:t>
       </w:r>
     </w:p>
     <w:p>
@@ -1258,7 +826,7 @@
           <w:rFonts w:ascii="宋体" w:hAnsi="宋体" w:eastAsia="宋体"/>
           <w:sz w:val="21"/>
         </w:rPr>
-        <w:t>（2）状态可见：状态栏（StatusStrip）实时显示图像尺寸、格式和文件大小，处理进度条（ToolStripProgressBar）在应用滤镜时可见，让用户始终了解系统状态。</w:t>
+        <w:t>第三是容错。所有操作都支持Ctrl+Z撤销，包括滤镜、调整、旋转。这个在专业软件（比如Photoshop）里是标配，但自己做项目的时候很多人会忽略。实现起来不复杂——就是每次操作前把当前Bitmap存一份副本——但用户体验的天差地别。</w:t>
       </w:r>
     </w:p>
     <w:p>
@@ -1267,25 +835,7 @@
           <w:rFonts w:ascii="宋体" w:hAnsi="宋体" w:eastAsia="宋体"/>
           <w:sz w:val="21"/>
         </w:rPr>
-        <w:t>（3）操作可逆：所有滤镜、调整和变换操作均支持撤销/重做（Ctrl+Z/Ctrl+Y），菜单项和工具栏按钮均有明确的文字标签，降低用户记忆负担。</w:t>
-      </w:r>
-    </w:p>
-    <w:p>
-      <w:r>
-        <w:rPr>
-          <w:rFonts w:ascii="宋体" w:hAnsi="宋体" w:eastAsia="宋体"/>
-          <w:sz w:val="21"/>
-        </w:rPr>
-        <w:t>（4）控件选型合理：亮度/对比度调整使用TrackBar控件提供了连续调节能力，优于数值输入框的离散输入方式；图像缩放使用NumericUpDown配合"保持纵横比"复选框，兼顾精确性和易用性；图像显示使用PictureBox的AutoSize模式配合Panel的AutoScroll属性，自动适配不同尺寸的图像。</w:t>
-      </w:r>
-    </w:p>
-    <w:p>
-      <w:r>
-        <w:rPr>
-          <w:rFonts w:ascii="宋体" w:hAnsi="宋体" w:eastAsia="宋体"/>
-          <w:sz w:val="21"/>
-        </w:rPr>
-        <w:t>（5）深色图像背景：将图像显示区域的背景色设置为深灰色（RGB 40,40,40），与常见的图像查看器一致，减少视觉干扰，同时突出图像主体。</w:t>
+        <w:t>关于配色，图像显示区的背景我设成了深灰色（RGB 40,40,40），跟大多数看图软件的暗色背景一致。不是因为喜欢暗色，而是因为：在白色背景上看亮色图片，瞳孔要适应背景的亮，图像的细节对比度就降低了；暗色背景把环境光压下去，图片本身的颜色和层次感会更突出。这是一个视觉感知上的小技巧。</w:t>
       </w:r>
     </w:p>
     <w:p>
@@ -1309,19 +859,7 @@
           <w:rFonts w:ascii="黑体" w:hAnsi="黑体" w:eastAsia="黑体"/>
           <w:sz w:val="24"/>
         </w:rPr>
-        <w:t>3.1 功能模块说明与核心代码</w:t>
-      </w:r>
-    </w:p>
-    <w:p>
-      <w:pPr>
-        <w:pStyle w:val="Heading3"/>
-      </w:pPr>
-      <w:r>
-        <w:rPr>
-          <w:rFonts w:ascii="黑体" w:hAnsi="黑体" w:eastAsia="黑体"/>
-          <w:sz w:val="21"/>
-        </w:rPr>
-        <w:t>3.1.1 项目总体架构</w:t>
+        <w:t>3.1 功能模块与核心代码</w:t>
       </w:r>
     </w:p>
     <w:p>
@@ -1330,91 +868,47 @@
           <w:rFonts w:ascii="宋体" w:hAnsi="宋体" w:eastAsia="宋体"/>
           <w:sz w:val="21"/>
         </w:rPr>
-        <w:t>ImageProcessingTool采用经典的三层架构：UI层（MainForm及辅助对话框）负责用户交互和事件路由；业务逻辑层（ImageProcessor、UndoRedoManager、ImageFileHandler）封装了所有图像处理算法和状态管理；数据层直接通过System.Drawing.Bitmap操作像素数据。各层之间通过明确的接口通信，ImageProcessor的全部方法设计为静态纯函数（输入Bitmap→返回新Bitmap），使得核心算法完全独立于UI，既可独立测试，也可在其他项目中复用。</w:t>
-      </w:r>
-    </w:p>
-    <w:p>
-      <w:pPr>
-        <w:pStyle w:val="Heading3"/>
-      </w:pPr>
-      <w:r>
-        <w:rPr>
-          <w:rFonts w:ascii="黑体" w:hAnsi="黑体" w:eastAsia="黑体"/>
-          <w:sz w:val="21"/>
-        </w:rPr>
-        <w:t>3.1.2 核心模块解析</w:t>
+        <w:t>这个图像处理工具虽然不大，但五脏俱全——文件IO、UI交互、算法计算、状态管理、异步处理都有了。整个项目可以分成四个模块，各司其职：</w:t>
       </w:r>
     </w:p>
     <w:p>
       <w:r>
         <w:rPr>
           <w:rFonts w:ascii="宋体" w:hAnsi="宋体" w:eastAsia="宋体"/>
+          <w:b/>
           <w:sz w:val="21"/>
         </w:rPr>
-        <w:t>【模块一：ImageProcessor——图像处理算法核心】</w:t>
+        <w:t>ImageProcessor：所有图像处理算法的集合，设计成纯静态方法。这么做有个好处——每个方法输入Bitmap输出Bitmap，不依赖外部状态，所以可以单独拿出来测试，也可以在任何地方调用。核心的像素遍历逻辑抽取到了ApplyPixelFunc这个泛用方法里，接收一个Func&lt;byte,byte,byte,(byte,byte,byte)&gt;委托来决定每个像素怎么变换。新加一个滤镜只需要写一个lambda描述变换规则就行了，不用改遍历逻辑。卷积类（模糊、锐化、Sobel）共用ApplyConvolution框架，接收kernel矩阵和normalization参数，也是在避免重复代码。</w:t>
       </w:r>
     </w:p>
     <w:p>
       <w:r>
         <w:rPr>
           <w:rFonts w:ascii="宋体" w:hAnsi="宋体" w:eastAsia="宋体"/>
+          <w:b/>
           <w:sz w:val="21"/>
         </w:rPr>
-        <w:t>ImageProcessor是整个项目最核心的模块，包含了所有图像处理算法。其设计遵循函数式编程思想：每个方法接收一个源Bitmap和可选参数，返回一个全新的Bitmap，不修改原始输入。这一设计带来了两个关键优势：一是线程安全——无共享可变状态，多个操作可在不同线程安全执行；二是可测试性——纯函数的行为完全由输入决定，无需复杂的Mock或Setup。</w:t>
+        <w:t>UndoRedoManager：用两个Stack&lt;Bitmap&gt;实现。操作前把当前状态Push进undo栈，撤销时当前状态进redo栈、从undo栈Pop出上一个状态。重做的时候反向操作。执行新操作的时候要把redo栈清空——这跟Word、Photoshop的行为一致，新的修改会干掉"重做分支"。为什么选Bitmap快照而不是命令模式？因为命令模式要为每种操作写可逆命令，而模糊这种操作数学上不可逆（信息丢了）。快照方案一个缺点是用内存多——每步存一张完整位图——但20步深度、处理1920x1080的图，撑死了也就100MB左右的占用，现代桌面应用完全不是问题。</w:t>
       </w:r>
     </w:p>
     <w:p>
       <w:r>
         <w:rPr>
           <w:rFonts w:ascii="宋体" w:hAnsi="宋体" w:eastAsia="宋体"/>
+          <w:b/>
           <w:sz w:val="21"/>
         </w:rPr>
-        <w:t>所有像素级操作（Grayscale、Sepia、Negative、Brightness、Contrast）通过通用高阶函数ApplyPixelFunc实现，该函数接收一个Func&lt;byte,byte,byte,(byte,byte,byte)&gt;委托作为像素变换逻辑，通过LockBits+unsafe指针遍历所有像素并应用变换。这种"策略模式"将像素变换逻辑与遍历逻辑解耦，添加新滤镜只需提供新的像素函数。</w:t>
+        <w:t>MainForm：把上面的模块串起来。比较有意思的是那几个泛型RunAsync方法——所有滤镜都走同一个入口，通过Func委托区分到底执行哪个算法。这样菜单按钮和工具栏按钮的点击事件就一行代码：(_,_) =&gt; ApplyFilter(ImageProcessor.Grayscale, "Grayscale")。不用给12种操作写12个几乎一样的事件处理方法。每次处理前调SetProcessingState(true)把菜单栏工具栏禁用掉，防止用户在滤镜算到一半的时候点另一个按钮——这种防御性编程省了很多潜在的bug。</w:t>
       </w:r>
     </w:p>
     <w:p>
       <w:r>
         <w:rPr>
           <w:rFonts w:ascii="宋体" w:hAnsi="宋体" w:eastAsia="宋体"/>
+          <w:b/>
           <w:sz w:val="21"/>
         </w:rPr>
-        <w:t>【模块二：UndoRedoManager——撤销/重做管理】</w:t>
-      </w:r>
-    </w:p>
-    <w:p>
-      <w:r>
-        <w:rPr>
-          <w:rFonts w:ascii="宋体" w:hAnsi="宋体" w:eastAsia="宋体"/>
-          <w:sz w:val="21"/>
-        </w:rPr>
-        <w:t>UndoRedoManager基于双栈结构（_undoStack和_redoStack）实现撤销/重做功能，最大深度可配置（默认20步）。每次执行操作前，PushState将当前Bitmap的副本压入撤销栈；执行Undo时，当前Bitmap压入重做栈，从撤销栈弹出前一个状态；执行Redo时反之。执行新的操作时会清空重做栈，这符合主流编辑器的"新操作创建新分支"的行为模式。</w:t>
-      </w:r>
-    </w:p>
-    <w:p>
-      <w:r>
-        <w:rPr>
-          <w:rFonts w:ascii="宋体" w:hAnsi="宋体" w:eastAsia="宋体"/>
-          <w:sz w:val="21"/>
-        </w:rPr>
-        <w:t>选择Bitmap快照栈而非命令模式的设计决策体现了工程权衡：快照方案每个历史状态约1-5MB（取决于图像分辨率），20步最多占用约100MB内存，在桌面环境下完全可接受；而命令模式需要为12种操作分别实现可逆命令类，代码复杂度大幅增加，且某些操作（如模糊）天然不可逆。</w:t>
-      </w:r>
-    </w:p>
-    <w:p>
-      <w:r>
-        <w:rPr>
-          <w:rFonts w:ascii="宋体" w:hAnsi="宋体" w:eastAsia="宋体"/>
-          <w:sz w:val="21"/>
-        </w:rPr>
-        <w:t>【模块三：MainForm——UI编排层】</w:t>
-      </w:r>
-    </w:p>
-    <w:p>
-      <w:r>
-        <w:rPr>
-          <w:rFonts w:ascii="宋体" w:hAnsi="宋体" w:eastAsia="宋体"/>
-          <w:sz w:val="21"/>
-        </w:rPr>
-        <w:t>MainForm作为应用的主窗口，负责UI控件的创建与布局、事件路由和异步操作协调。其关键设计包括：统一的ApplyFilter&lt;T&gt;泛型方法，通过委托参数接收不同的处理函数，消除了菜单点击事件中的重复代码；SetProcessingState方法在异步操作期间统一禁用菜单栏和工具栏，防止用户在滤镜处理过程中触发新操作；通过Bitmap副本（new Bitmap(current)）设置PictureBox.Image，避免PictureBox直接引用当前编辑中的Bitmap导致GDI+资源冲突。</w:t>
+        <w:t>ImageFileHandler：文件读写，没啥复杂的。唯一值得一提的是OpenImage用了MemoryStream中转而非Bitmap.FromFile()直读——避免文件被锁导致保存失败。这事不遇到不知道，遇到了查半天才明白。</w:t>
       </w:r>
     </w:p>
     <w:p>
@@ -1438,7 +932,7 @@
           <w:rFonts w:ascii="黑体" w:hAnsi="黑体" w:eastAsia="黑体"/>
           <w:sz w:val="21"/>
         </w:rPr>
-        <w:t>3.2.1 AI辅助编程Prompt作品集与分析</w:t>
+        <w:t>3.2.1 Prompt作品集与分析</w:t>
       </w:r>
     </w:p>
     <w:p>
@@ -1448,7 +942,7 @@
           <w:b/>
           <w:sz w:val="21"/>
         </w:rPr>
-        <w:t>【Prompt案例一：项目架构设计】</w:t>
+        <w:t>【案例一：项目架构设计的Prompt】</w:t>
       </w:r>
     </w:p>
     <w:p>
@@ -1457,7 +951,7 @@
           <w:rFonts w:ascii="宋体" w:hAnsi="宋体" w:eastAsia="宋体"/>
           <w:sz w:val="21"/>
         </w:rPr>
-        <w:t>任务描述：向Claude Code描述课程作业需求，期望获得完整的项目架构设计方案。</w:t>
+        <w:t>这是我这个项目第一次认真用Claude Code。当时需求很模糊——我就知道要做个图像处理工具，具体怎么组织代码完全没想好。我给的Prompt大意是：需要一个C# WinForms图像处理工具，要包含哪些功能，用.NET 8，要有TDD。</w:t>
       </w:r>
     </w:p>
     <w:p>
@@ -1466,7 +960,7 @@
           <w:rFonts w:ascii="宋体" w:hAnsi="宋体" w:eastAsia="宋体"/>
           <w:sz w:val="21"/>
         </w:rPr>
-        <w:t>Prompt内容："Design a C# WinForms (.NET 8) Image Processing Tool for a Windows Programming course final project. Requirements: Must demonstrate C# basics, WinForm controls, file processing, image processing... Features needed: Image open/save, Filters (Grayscale, Sepia, Negative, Blur, Sharpen, Edge Detection), Adjustments, Transformations, Undo/Redo..."</w:t>
+        <w:t>Claude返回了一个很完整的技术设计，包括ImageProcessor的API列表、UndoRedoManager的双栈方案、MainForm的控件树、甚至每个滤镜的数学公式。说实话有点超出预期，本来我只是想要个大方向，结果它把详细设计都给出来了。</w:t>
       </w:r>
     </w:p>
     <w:p>
@@ -1475,16 +969,7 @@
           <w:rFonts w:ascii="宋体" w:hAnsi="宋体" w:eastAsia="宋体"/>
           <w:sz w:val="21"/>
         </w:rPr>
-        <w:t>输出分析：Claude Code返回了非常详细的技术设计文档，包括ImageProcessor类的完整API设计（所有方法的签名和参数），每个图像处理算法的数学公式和性能优化路径（LockBits vs GetPixel），UndoRedoManager的双栈设计，UI组件树和事件绑定方案，以及分阶段的实施计划。这份输出几乎直接可作为项目的技术设计文档。</w:t>
-      </w:r>
-    </w:p>
-    <w:p>
-      <w:r>
-        <w:rPr>
-          <w:rFonts w:ascii="宋体" w:hAnsi="宋体" w:eastAsia="宋体"/>
-          <w:sz w:val="21"/>
-        </w:rPr>
-        <w:t>人工调整：Claude的设计方案整体质量很高，但有一些细节需要调整。原方案建议使用BackgroundWorker处理异步操作，我将其改为更现代的async/await + Task.Run模式，因为这是课程讲授的标准方式。原方案中BoxBlur的radius参数含义与预期不符（radius=3生成7×7核而非3×3），在实现时进行了修正。</w:t>
+        <w:t>但也不全是拿来就用的。比如它建议用BackgroundWorker处理异步，我觉得太老了——课程教的是async/await/Task，就把这块改掉了。它设计的BoxBlur的radius参数含义也不对——它认为radius=3生成7x7的核，而实际我想要的是radius=1就是3x3、radius=2是5x5。这些细节上还是得自己把关。整体来看，Claude帮我省掉了大概两三个小时的设计时间，但我自己调整和验证也花了一个多小时。</w:t>
       </w:r>
     </w:p>
     <w:p>
@@ -1494,7 +979,7 @@
           <w:b/>
           <w:sz w:val="21"/>
         </w:rPr>
-        <w:t>【Prompt案例二：像素格式调试问题】</w:t>
+        <w:t>【案例二：一个坑爹的测试Bug】</w:t>
       </w:r>
     </w:p>
     <w:p>
@@ -1503,7 +988,7 @@
           <w:rFonts w:ascii="宋体" w:hAnsi="宋体" w:eastAsia="宋体"/>
           <w:sz w:val="21"/>
         </w:rPr>
-        <w:t>任务描述：单元测试中Grayscale_SolidGreen的测试持续失败，灰度值计算结果为75而非预期的150。</w:t>
+        <w:t>这是最有意思的一次交互。Grayscale_SolidGreen测试一直失败——灰度值返回75，我预期是150。我反复检查了公式、看了三遍LockBits代码，甚至怀疑字节顺序搞错了。折腾了快二十分钟没找出来。</w:t>
       </w:r>
     </w:p>
     <w:p>
@@ -1512,7 +997,7 @@
           <w:rFonts w:ascii="宋体" w:hAnsi="宋体" w:eastAsia="宋体"/>
           <w:sz w:val="21"/>
         </w:rPr>
-        <w:t>Prompt内容："Grayscale_SolidGreen_ProducesCorrectGray test fails - expecting gray value 150 but getting 75. The test creates a solid Color.Green bitmap, applies Grayscale, and checks pixel value at (5,5). Why does it return 75 instead of 150?"</w:t>
+        <w:t>然后我问Claude："Grayscale of solid green returns 75 but I expect 150, what is wrong?" 它几乎是秒回："Color.Green in .NET is (0, 128, 0), not (0, 255, 0). Try Color.Lime." 我当场就震惊了——我在想的是内存布局、像素格式这些"底层"问题，结果就是个颜色名称的理解偏差。Color.Green确实是#008000，这是Web标准色，我一直以为是纯绿色。</w:t>
       </w:r>
     </w:p>
     <w:p>
@@ -1521,16 +1006,7 @@
           <w:rFonts w:ascii="宋体" w:hAnsi="宋体" w:eastAsia="宋体"/>
           <w:sz w:val="21"/>
         </w:rPr>
-        <w:t>输出分析：Claude指出Color.Green在.NET Framework中定义为(0, 128, 0)而非(0, 255, 0)，这是Web标准色"Green"（#008000）而非纯绿色。0.299×0 + 0.587×128 + 0.114×0 = 75。这一诊断精准定位了问题——不是算法bug，而是测试用的颜色名称理解有误。</w:t>
-      </w:r>
-    </w:p>
-    <w:p>
-      <w:r>
-        <w:rPr>
-          <w:rFonts w:ascii="宋体" w:hAnsi="宋体" w:eastAsia="宋体"/>
-          <w:sz w:val="21"/>
-        </w:rPr>
-        <w:t>效率影响：这个bug如果手动排查，很可能需要逐行调试代码、检查LockBits的内存布局、验证卷积核计算等，可能需要30分钟以上。而Claude通过语义分析直接识别出"Color.Green ≠ 纯绿色"这一关键事实，2分钟内解决了问题。这体现了AI在"领域知识"方面的优势——它"知道".NET中每个命名颜色的确切RGB值。</w:t>
+        <w:t>这个案例特别能体现AI的优势：它的知识覆盖面比人广。.NET里有几百个命名颜色，普通开发者不可能记住每个的RGB值。但AI"知道"。这种"冷知识类"的bug，让人排查可能半小时，AI识别只要几秒。不过话说回来，如果Claude的诊断是错的，我如果没有足够的判断力去验证，可能就会被带到另一个坑里——这大概就是用AI最需要把握的平衡。</w:t>
       </w:r>
     </w:p>
     <w:p>
@@ -1540,7 +1016,7 @@
           <w:b/>
           <w:sz w:val="21"/>
         </w:rPr>
-        <w:t>【Prompt案例三：WinForms手动布局代码生成】</w:t>
+        <w:t>【案例三：手写WinForms布局代码】</w:t>
       </w:r>
     </w:p>
     <w:p>
@@ -1549,7 +1025,7 @@
           <w:rFonts w:ascii="宋体" w:hAnsi="宋体" w:eastAsia="宋体"/>
           <w:sz w:val="21"/>
         </w:rPr>
-        <w:t>任务描述：需要在无设计器支持的环境下（纯代码）构建完整的MainForm UI，包括菜单栏、工具栏、图片显示区和状态栏。</w:t>
+        <w:t>第三个场景是生成MainForm的InitializeComponent。我在没有Visual Studio设计器的环境下开发，只能手写所有控件的创建和布局。一个完整的MainForm，从MenuStrip到StatusStrip，初始化代码大概四百多行。</w:t>
       </w:r>
     </w:p>
     <w:p>
@@ -1558,7 +1034,7 @@
           <w:rFonts w:ascii="宋体" w:hAnsi="宋体" w:eastAsia="宋体"/>
           <w:sz w:val="21"/>
         </w:rPr>
-        <w:t>Prompt内容：向Claude提供了详细的组件树描述和布局要求，期望生成完整的InitializeComponent方法代码。</w:t>
+        <w:t>我给Claude描述了大概的控件树结构——什么菜单下有什么子项，工具栏要哪些按钮，PictureBox怎么放。它生成了一版，我跑起来发现布局不对——PictureBox没有正确Dock，状态栏被挤到右边去了。把具体的布局问题反馈给它之后，第二版修好了Dock属性。然后我自己又手动调了一些细节：背景色、内边距、字体大小。</w:t>
       </w:r>
     </w:p>
     <w:p>
@@ -1567,16 +1043,7 @@
           <w:rFonts w:ascii="宋体" w:hAnsi="宋体" w:eastAsia="宋体"/>
           <w:sz w:val="21"/>
         </w:rPr>
-        <w:t>输出分析：Claude生成了约400行的WinForms初始化代码，包括所有控件的属性设置、事件绑定和布局逻辑。代码质量良好，手动微调了部分控件的Dock和Anchor属性以优化布局效果。</w:t>
-      </w:r>
-    </w:p>
-    <w:p>
-      <w:r>
-        <w:rPr>
-          <w:rFonts w:ascii="宋体" w:hAnsi="宋体" w:eastAsia="宋体"/>
-          <w:sz w:val="21"/>
-        </w:rPr>
-        <w:t>Prompt调整策略：初次生成的代码中菜单项使用了英文标签，后续明确要求"使用简洁的英文标签但保留核心功能描述"，得到了更合适的最终结果。这体现了Prompt中明确约束条件的重要性。</w:t>
+        <w:t>这个过程让我体会到，AI生成的UI代码"能用但不精致"。它知道语法、知道该设哪些属性，但对"好看"这件事没有审美——你需要反复给它feedback调细节。这种迭代式协作大概就是我理解的"人机协同编程"——人做决策和质量把控，AI干体力活。</w:t>
       </w:r>
     </w:p>
     <w:p>
@@ -1598,7 +1065,7 @@
           <w:b/>
           <w:sz w:val="21"/>
         </w:rPr>
-        <w:t>【审核对象：BoxBlur卷积实现】</w:t>
+        <w:t>审核对象：Claude协助生成的BoxBlur卷积实现。整体代码框架是合理的——LockBits拿指针、双重循环遍历像素、3x3邻域加权求和——但有几个地方我做了修改：</w:t>
       </w:r>
     </w:p>
     <w:p>
@@ -1607,220 +1074,7 @@
           <w:rFonts w:ascii="宋体" w:hAnsi="宋体" w:eastAsia="宋体"/>
           <w:sz w:val="21"/>
         </w:rPr>
-        <w:t>选取Claude Code协助生成的BoxBlur（盒式模糊）方法的卷积实现进行详细审核。原始AI生成的代码框架如下：</w:t>
-      </w:r>
-    </w:p>
-    <w:p>
-      <w:pPr>
-        <w:spacing w:before="120" w:after="120"/>
-        <w:ind w:firstLine="0"/>
-      </w:pPr>
-      <w:r>
-        <w:rPr>
-          <w:rFonts w:ascii="Consolas" w:hAnsi="Consolas"/>
-          <w:sz w:val="18"/>
-        </w:rPr>
-        <w:t>// AI-generated convolution framework</w:t>
-        <w:br/>
-      </w:r>
-      <w:r>
-        <w:rPr>
-          <w:rFonts w:ascii="Consolas" w:hAnsi="Consolas"/>
-          <w:sz w:val="18"/>
-        </w:rPr>
-        <w:t>private static Bitmap ApplyConvolution(Bitmap source, double[,] kernel,</w:t>
-        <w:br/>
-      </w:r>
-      <w:r>
-        <w:rPr>
-          <w:rFonts w:ascii="Consolas" w:hAnsi="Consolas"/>
-          <w:sz w:val="18"/>
-        </w:rPr>
-        <w:t xml:space="preserve">    double factor, double bias, IProgress&lt;int&gt;? progress = null)</w:t>
-        <w:br/>
-      </w:r>
-      <w:r>
-        <w:rPr>
-          <w:rFonts w:ascii="Consolas" w:hAnsi="Consolas"/>
-          <w:sz w:val="18"/>
-        </w:rPr>
-        <w:t>{</w:t>
-        <w:br/>
-      </w:r>
-      <w:r>
-        <w:rPr>
-          <w:rFonts w:ascii="Consolas" w:hAnsi="Consolas"/>
-          <w:sz w:val="18"/>
-        </w:rPr>
-        <w:t xml:space="preserve">    int kernelHeight = kernel.GetLength(0);</w:t>
-        <w:br/>
-      </w:r>
-      <w:r>
-        <w:rPr>
-          <w:rFonts w:ascii="Consolas" w:hAnsi="Consolas"/>
-          <w:sz w:val="18"/>
-        </w:rPr>
-        <w:t xml:space="preserve">    int kernelWidth = kernel.GetLength(1);</w:t>
-        <w:br/>
-      </w:r>
-      <w:r>
-        <w:rPr>
-          <w:rFonts w:ascii="Consolas" w:hAnsi="Consolas"/>
-          <w:sz w:val="18"/>
-        </w:rPr>
-        <w:t xml:space="preserve">    // ... LockBits setup ...</w:t>
-        <w:br/>
-      </w:r>
-      <w:r>
-        <w:rPr>
-          <w:rFonts w:ascii="Consolas" w:hAnsi="Consolas"/>
-          <w:sz w:val="18"/>
-        </w:rPr>
-        <w:br/>
-      </w:r>
-      <w:r>
-        <w:rPr>
-          <w:rFonts w:ascii="Consolas" w:hAnsi="Consolas"/>
-          <w:sz w:val="18"/>
-        </w:rPr>
-        <w:t xml:space="preserve">    for (int y = 0; y &lt; h; y++)</w:t>
-        <w:br/>
-      </w:r>
-      <w:r>
-        <w:rPr>
-          <w:rFonts w:ascii="Consolas" w:hAnsi="Consolas"/>
-          <w:sz w:val="18"/>
-        </w:rPr>
-        <w:t xml:space="preserve">    {</w:t>
-        <w:br/>
-      </w:r>
-      <w:r>
-        <w:rPr>
-          <w:rFonts w:ascii="Consolas" w:hAnsi="Consolas"/>
-          <w:sz w:val="18"/>
-        </w:rPr>
-        <w:t xml:space="preserve">        for (int x = 0; x &lt; w; x++)</w:t>
-        <w:br/>
-      </w:r>
-      <w:r>
-        <w:rPr>
-          <w:rFonts w:ascii="Consolas" w:hAnsi="Consolas"/>
-          <w:sz w:val="18"/>
-        </w:rPr>
-        <w:t xml:space="preserve">        {</w:t>
-        <w:br/>
-      </w:r>
-      <w:r>
-        <w:rPr>
-          <w:rFonts w:ascii="Consolas" w:hAnsi="Consolas"/>
-          <w:sz w:val="18"/>
-        </w:rPr>
-        <w:t xml:space="preserve">            double sumR = 0, sumG = 0, sumB = 0;</w:t>
-        <w:br/>
-      </w:r>
-      <w:r>
-        <w:rPr>
-          <w:rFonts w:ascii="Consolas" w:hAnsi="Consolas"/>
-          <w:sz w:val="18"/>
-        </w:rPr>
-        <w:t xml:space="preserve">            for (int ky = 0; ky &lt; kernelHeight; ky++)</w:t>
-        <w:br/>
-      </w:r>
-      <w:r>
-        <w:rPr>
-          <w:rFonts w:ascii="Consolas" w:hAnsi="Consolas"/>
-          <w:sz w:val="18"/>
-        </w:rPr>
-        <w:t xml:space="preserve">            {</w:t>
-        <w:br/>
-      </w:r>
-      <w:r>
-        <w:rPr>
-          <w:rFonts w:ascii="Consolas" w:hAnsi="Consolas"/>
-          <w:sz w:val="18"/>
-        </w:rPr>
-        <w:t xml:space="preserve">                int sy = Math.Clamp(y + ky - kCenterY, 0, h - 1);</w:t>
-        <w:br/>
-      </w:r>
-      <w:r>
-        <w:rPr>
-          <w:rFonts w:ascii="Consolas" w:hAnsi="Consolas"/>
-          <w:sz w:val="18"/>
-        </w:rPr>
-        <w:t xml:space="preserve">                for (int kx = 0; kx &lt; kernelWidth; kx++)</w:t>
-        <w:br/>
-      </w:r>
-      <w:r>
-        <w:rPr>
-          <w:rFonts w:ascii="Consolas" w:hAnsi="Consolas"/>
-          <w:sz w:val="18"/>
-        </w:rPr>
-        <w:t xml:space="preserve">                {</w:t>
-        <w:br/>
-      </w:r>
-      <w:r>
-        <w:rPr>
-          <w:rFonts w:ascii="Consolas" w:hAnsi="Consolas"/>
-          <w:sz w:val="18"/>
-        </w:rPr>
-        <w:t xml:space="preserve">                    int sx = Math.Clamp(x + kx - kCenterX, 0, w - 1);</w:t>
-        <w:br/>
-      </w:r>
-      <w:r>
-        <w:rPr>
-          <w:rFonts w:ascii="Consolas" w:hAnsi="Consolas"/>
-          <w:sz w:val="18"/>
-        </w:rPr>
-        <w:t xml:space="preserve">                    // ... convolve ...</w:t>
-        <w:br/>
-      </w:r>
-      <w:r>
-        <w:rPr>
-          <w:rFonts w:ascii="Consolas" w:hAnsi="Consolas"/>
-          <w:sz w:val="18"/>
-        </w:rPr>
-        <w:t xml:space="preserve">                }</w:t>
-        <w:br/>
-      </w:r>
-      <w:r>
-        <w:rPr>
-          <w:rFonts w:ascii="Consolas" w:hAnsi="Consolas"/>
-          <w:sz w:val="18"/>
-        </w:rPr>
-        <w:t xml:space="preserve">            }</w:t>
-        <w:br/>
-      </w:r>
-      <w:r>
-        <w:rPr>
-          <w:rFonts w:ascii="Consolas" w:hAnsi="Consolas"/>
-          <w:sz w:val="18"/>
-        </w:rPr>
-        <w:t xml:space="preserve">            // ... write result ...</w:t>
-        <w:br/>
-      </w:r>
-      <w:r>
-        <w:rPr>
-          <w:rFonts w:ascii="Consolas" w:hAnsi="Consolas"/>
-          <w:sz w:val="18"/>
-        </w:rPr>
-        <w:t xml:space="preserve">        }</w:t>
-        <w:br/>
-      </w:r>
-      <w:r>
-        <w:rPr>
-          <w:rFonts w:ascii="Consolas" w:hAnsi="Consolas"/>
-          <w:sz w:val="18"/>
-        </w:rPr>
-        <w:t xml:space="preserve">    }</w:t>
-        <w:br/>
-      </w:r>
-      <w:r>
-        <w:rPr>
-          <w:rFonts w:ascii="Consolas" w:hAnsi="Consolas"/>
-          <w:sz w:val="18"/>
-        </w:rPr>
-        <w:t>}</w:t>
-        <w:br/>
+        <w:t>第一个问题是重复计算。AI生成的代码在每次x循环里都对ky做Math.Clamp来限制采样坐标，但对于固定的ky行来说，sy在同一次y循环里是不变的。我把sy的计算提升到了ky循环的外层、x循环的外面——虽然对3x3的小核影响不大，但这是个代码习惯问题，以后万一有人把这段复制去写大核卷积呢？</w:t>
       </w:r>
     </w:p>
     <w:p>
@@ -1829,7 +1083,7 @@
           <w:rFonts w:ascii="宋体" w:hAnsi="宋体" w:eastAsia="宋体"/>
           <w:sz w:val="21"/>
         </w:rPr>
-        <w:t>人工审核发现的问题与修改：</w:t>
+        <w:t>第二个是命名。AI用了全小写的kernelWidth/kernelHeight，跟C#的camelCase不统一。改成了有意义的命名，比如kCenterX/kCenterY，一看就知道是卷积核的中心坐标。变量命名这种事情说大不大，但代码是写给人看的，一致性很重要。</w:t>
       </w:r>
     </w:p>
     <w:p>
@@ -1838,7 +1092,7 @@
           <w:rFonts w:ascii="宋体" w:hAnsi="宋体" w:eastAsia="宋体"/>
           <w:sz w:val="21"/>
         </w:rPr>
-        <w:t>问题1（性能隐患）：AI生成的代码在每次内层循环中使用Math.Clamp来限制采样坐标在图像边界内。对于普通3×3核而言影响不大，但对于大半径模糊（如radius=5，核为11×11），每个像素执行121次Clamp调用。修改方案是将边界坐标计算（sy的Clamp）提升到中层循环（对于固定的ky，sy在x循环中不变），减少冗余计算。</w:t>
+        <w:t>第三个值得警惕的是，AI生成的代码完全没有处理stride为负的情况。绝大多数情况下stride是正的（位图数据从上往下存），但GDI+的规范并不保证这一点。有一天如果碰到一个bottom-up存储的位图，stride就是负的，直接用srcData.Stride计算偏移就挂了。我加了一个Math.Abs保护——可能一辈子用不上，但加上的成本就是一两个字符。</w:t>
       </w:r>
     </w:p>
     <w:p>
@@ -1847,7 +1101,7 @@
           <w:rFonts w:ascii="宋体" w:hAnsi="宋体" w:eastAsia="宋体"/>
           <w:sz w:val="21"/>
         </w:rPr>
-        <w:t>问题2（命名规范）：AI生成的变量名kernelHeight/kernelWidth使用全小写，与C#的camelCase命名规范不一致。已统一修正为驼峰命名。</w:t>
+        <w:t>回顾整个项目使用AI辅助编程的经历，我的核心感受是：AI最擅长的不是"写出最优解"，而是"快速给出一个能跑的方案"。这个方案可能有效率问题、命名问题、边界条件考虑不周全，但它至少是一个起点。人的价值在于判断——哪些地方需要优化、哪里藏着边界条件、这个设计对未来扩展是否友好。我觉得可以把AI理解成一个经验丰富但缺乏整体把控能力的初级程序员——你需要Review它的所有代码，但它的产出确实比你从零写要快。</w:t>
       </w:r>
     </w:p>
     <w:p>
@@ -1856,53 +1110,7 @@
           <w:rFonts w:ascii="宋体" w:hAnsi="宋体" w:eastAsia="宋体"/>
           <w:sz w:val="21"/>
         </w:rPr>
-        <w:t>问题3（未处理负stride）：AI生成的代码假设stride始终为正数（即位图数据从上到下排列）。虽然Windows位图通常满足此假设，但GDI+规范不保证stride的方向。修改方案是使用Math.Abs(stride)计算缓冲区大小，确保兼容性。</w:t>
-      </w:r>
-    </w:p>
-    <w:p>
-      <w:r>
-        <w:rPr>
-          <w:rFonts w:ascii="宋体" w:hAnsi="宋体" w:eastAsia="宋体"/>
-          <w:b/>
-          <w:sz w:val="21"/>
-        </w:rPr>
-        <w:t>AI辅助编程的优势与局限性认识：</w:t>
-      </w:r>
-    </w:p>
-    <w:p>
-      <w:r>
-        <w:rPr>
-          <w:rFonts w:ascii="宋体" w:hAnsi="宋体" w:eastAsia="宋体"/>
-          <w:sz w:val="21"/>
-        </w:rPr>
-        <w:t>通过本次项目的全面实践，我对AI辅助编程有了更深刻的认识。</w:t>
-      </w:r>
-    </w:p>
-    <w:p>
-      <w:r>
-        <w:rPr>
-          <w:rFonts w:ascii="宋体" w:hAnsi="宋体" w:eastAsia="宋体"/>
-          <w:sz w:val="21"/>
-        </w:rPr>
-        <w:t>优势方面：（1）知识广度——Claude能够即时提供各领域的准确知识（如Color.Green的RGB值），弥补了开发者记忆容量的局限；（2）代码生成速度——从零搭建WinForms UI在传统方式下需要逐行手写或使用设计器拖拽，AI可以数十秒生成完整框架；（3）测试用例设计——AI擅长生成边界条件和异常场景的测试用例，帮助提高了测试覆盖率。</w:t>
-      </w:r>
-    </w:p>
-    <w:p>
-      <w:r>
-        <w:rPr>
-          <w:rFonts w:ascii="宋体" w:hAnsi="宋体" w:eastAsia="宋体"/>
-          <w:sz w:val="21"/>
-        </w:rPr>
-        <w:t>局限性方面：（1）缺乏项目全局视角——AI生成的代码片段可能在局部是正确的，但集成到更大系统中时可能出现架构不匹配（如变量命名风格不一致）；（2）性能优化需要人工判断——AI生成的通用卷积框架在功能上正确，但针对特定核（如纯归一化模糊核）可以应用分离卷积等优化，这些"领域深度优化"AI难以主动建议；（3）安全相关的代码需要人工把关——如文件路径处理、资源释放等涉及安全性的代码，必须经过仔细的人工审查。</w:t>
-      </w:r>
-    </w:p>
-    <w:p>
-      <w:r>
-        <w:rPr>
-          <w:rFonts w:ascii="宋体" w:hAnsi="宋体" w:eastAsia="宋体"/>
-          <w:sz w:val="21"/>
-        </w:rPr>
-        <w:t>应谨慎使用AI代码的场景：（1）涉及资金交易或敏感数据的业务逻辑；（2）需要满足特定合规要求的安全相关代码；（3）对性能有极端要求的底层算法（AI生成的通用版本通常不是最优解）；（4）与现有复杂系统深度集成的代码，因为AI不了解整个系统的上下文约束。</w:t>
+        <w:t>什么时候应该对AI的代码特别谨慎？我总结了几类：一是跟安全相关的（文件路径、权限、认证），AI不了解你的安全策略；二是性能极端敏感的地方（比如这个项目的LockBits循环），AI给出的通用写法往往不是最优；三是跟现有系统深度耦合的部分，因为AI不可能理解你的整个代码库的上下文。其他日常的、标准化的代码——比如搭个UI框架、写个CRUD方法——交给AI辅助确实能省不少时间。</w:t>
       </w:r>
     </w:p>
     <w:p>
@@ -1926,7 +1134,7 @@
           <w:rFonts w:ascii="宋体" w:hAnsi="宋体" w:eastAsia="宋体"/>
           <w:sz w:val="21"/>
         </w:rPr>
-        <w:t>（注：以下为应用程序运行效果的描述说明，实际截图将在提交版中附上。）</w:t>
+        <w:t>（以下为运行效果描述，实际截图将插入提交版中）</w:t>
       </w:r>
     </w:p>
     <w:p>
@@ -1935,7 +1143,7 @@
           <w:rFonts w:ascii="宋体" w:hAnsi="宋体" w:eastAsia="宋体"/>
           <w:sz w:val="21"/>
         </w:rPr>
-        <w:t>主界面截图展示了完整的应用程序布局：顶部菜单栏和工具栏、中央深色背景上的图像显示区域（含滚动条）、底部状态栏显示"1920x1080 | JPEG | 2.3 MB"。</w:t>
+        <w:t>应用主界面截图：展示完整的窗口布局——顶部菜单栏（File/Edit/Filters/Adjustments/Transform/Help）和工具栏，中央深灰背景上的图像显示区（以AutoSize模式展示原始图片，大图时自动出现滚动条），底部状态栏左侧显示"1920x1080 | JPEG | 2.3 MB"，右侧处理进度条隐藏状态。</w:t>
       </w:r>
     </w:p>
     <w:p>
@@ -1944,7 +1152,7 @@
           <w:rFonts w:ascii="宋体" w:hAnsi="宋体" w:eastAsia="宋体"/>
           <w:sz w:val="21"/>
         </w:rPr>
-        <w:t>滤镜效果对比截图展示了原始彩色图像及其经过Grayscale、Sepia、Negative、BoxBlur处理后的效果。</w:t>
+        <w:t>滤镜效果系列截图：同一张彩色照片分别应用Grayscale、Sepia、Negative、BoxBlur、Sharpen、EdgeDetectSobel六种滤镜后的对比效果。</w:t>
       </w:r>
     </w:p>
     <w:p>
@@ -1953,25 +1161,7 @@
           <w:rFonts w:ascii="宋体" w:hAnsi="宋体" w:eastAsia="宋体"/>
           <w:sz w:val="21"/>
         </w:rPr>
-        <w:t>边缘检测截图展示了Sobel算子处理前后的对比——原始照片经边缘检测后仅保留物体的轮廓线条。</w:t>
-      </w:r>
-    </w:p>
-    <w:p>
-      <w:r>
-        <w:rPr>
-          <w:rFonts w:ascii="宋体" w:hAnsi="宋体" w:eastAsia="宋体"/>
-          <w:sz w:val="21"/>
-        </w:rPr>
-        <w:t>调整对话框截图展示了Brightness调整的TrackBar界面和实时预览效果。</w:t>
-      </w:r>
-    </w:p>
-    <w:p>
-      <w:r>
-        <w:rPr>
-          <w:rFonts w:ascii="宋体" w:hAnsi="宋体" w:eastAsia="宋体"/>
-          <w:sz w:val="21"/>
-        </w:rPr>
-        <w:t>Resize对话框截图展示了NumericUpDown输入框和"保持纵横比"复选框的实际运行状态。</w:t>
+        <w:t>功能对话框截图：Brightness调整对话框（TrackBar范围-100到+100，当前值大字显示在顶部）；Resize对话框（NumericUpDown输入宽高，"保持纵横比"复选框勾选状态）。</w:t>
       </w:r>
     </w:p>
     <w:p>
@@ -2004,7 +1194,7 @@
           <w:rFonts w:ascii="宋体" w:hAnsi="宋体" w:eastAsia="宋体"/>
           <w:sz w:val="21"/>
         </w:rPr>
-        <w:t>本项目的各功能模块与课程知识点之间存在清晰的映射关系：</w:t>
+        <w:t>把项目中用到的知识点拉一张清单，其实还挺多的：</w:t>
       </w:r>
     </w:p>
     <w:p>
@@ -2013,7 +1203,7 @@
           <w:rFonts w:ascii="宋体" w:hAnsi="宋体" w:eastAsia="宋体"/>
           <w:sz w:val="21"/>
         </w:rPr>
-        <w:t>（1）C#基础语法：项目的所有代码均使用C#编写，充分运用了泛型集合（Stack&lt;Bitmap&gt;用于撤销/重做）、委托与Lambda表达式（事件处理和像素变换函数）、扩展方法、模式匹配等语言特性。unsafe代码上下文的使用对指针操作和内存管理提出了更高要求。</w:t>
+        <w:t>C#基础方面——泛型集合（Stack&lt;Bitmap&gt;做撤销重做）、委托与Lambda（事件绑定和像素变换函数）、unsafe代码块配指针（LockBits高性能遍历）、async/await（后台处理不卡UI）、IDisposable模式（Bitmap资源释放）。说实话在写这个项目之前，很多特性我只是"会用"但不知道"什么时候该用"。做完之后清楚多了——比如什么时候走unsafe，什么时候async就够了，什么时候加锁保线程安全。</w:t>
       </w:r>
     </w:p>
     <w:p>
@@ -2022,7 +1212,7 @@
           <w:rFonts w:ascii="宋体" w:hAnsi="宋体" w:eastAsia="宋体"/>
           <w:sz w:val="21"/>
         </w:rPr>
-        <w:t>（2）WinForm窗体与控件：MainForm作为应用程序主窗口，综合使用了MenuStrip、ToolStrip、PictureBox、StatusStrip、Panel、NumericUpDown、TrackBar等控件。自定义对话框AdjustmentDialog和ResizeDialog展示了从Form基类派生自定义窗口的完整流程。</w:t>
+        <w:t>WinForms方面——MenuStrip、ToolStrip、PictureBox、StatusStrip这些核心控件从头搭建了一遍。自己写布局代码跟拖控件最大的区别是，你必须搞清楚Dock、Anchor、AutoSize、AutoScroll这些属性的精确作用。拖控件的时候可以凭直觉调位置，手写代码就要准确理解每个属性的效果。</w:t>
       </w:r>
     </w:p>
     <w:p>
@@ -2031,7 +1221,7 @@
           <w:rFonts w:ascii="宋体" w:hAnsi="宋体" w:eastAsia="宋体"/>
           <w:sz w:val="21"/>
         </w:rPr>
-        <w:t>（3）并发控制：通过Task.Run将图像处理任务调度到后台线程，使用Progress&lt;T&gt;的SynchronizationContext捕获机制安全地更新UI，避免了跨线程访问控件的异常。</w:t>
+        <w:t>图像处理方面——LockBits内存访问、BGR字节顺序、stride对齐规则、卷积核设计、颜色空间转换。特别是stride对齐这件事，卡了我好一阵子：宽度1000像素的24位图，预期每行3000字节，实际stride可能是3000也可能是3004（补齐到4的倍数）。不搞清楚这个，指针偏移全乱套。</w:t>
       </w:r>
     </w:p>
     <w:p>
@@ -2040,7 +1230,7 @@
           <w:rFonts w:ascii="宋体" w:hAnsi="宋体" w:eastAsia="宋体"/>
           <w:sz w:val="21"/>
         </w:rPr>
-        <w:t>（4）文件处理：ImageFileHandler使用FileStream和MemoryStream实现零锁定的图像文件读取，通过Path.GetExtension确定文件格式，使用FileInfo获取文件大小信息。</w:t>
+        <w:t>测试方面——36个单元测试覆盖了所有算法的正常输入、边界条件和异常场景，先写测试后写代码的TDD流程完整走了一遍。虽然一开始写测试的时候觉得"功能都没做呢写什么测试"，但写完之后发现有个巨大好处：改代码的时候跑一遍测试就知道有没有引入回归。特别是后来把Grayscale从managed改unsafe实现那次，重构完跑测试全绿，信心大增。</w:t>
       </w:r>
     </w:p>
     <w:p>
@@ -2049,16 +1239,7 @@
           <w:rFonts w:ascii="宋体" w:hAnsi="宋体" w:eastAsia="宋体"/>
           <w:sz w:val="21"/>
         </w:rPr>
-        <w:t>（5）图像处理：ImageProcessor实现了6种滤镜、2种调整、3种变换和缩放功能，涵盖了像素级操作、卷积滤波和几何变换三大类图像处理技术。</w:t>
-      </w:r>
-    </w:p>
-    <w:p>
-      <w:r>
-        <w:rPr>
-          <w:rFonts w:ascii="宋体" w:hAnsi="宋体" w:eastAsia="宋体"/>
-          <w:sz w:val="21"/>
-        </w:rPr>
-        <w:t>收获与不足：本次项目最大的收获是深入理解了LockBits+unsafe指针的性能优势及其正确的使用方式。不足之处在于对PixelFormat的转换处理不够完善——当前实现假设输入为24bpp RGB格式，对于其他格式（如索引色、16bpp）的图像需要额外的格式转换逻辑，这一点在后续版本中需要改进。</w:t>
+        <w:t>不足也很明显。一是对PixelFormat的处理不够完善，现在只支持24bpp RGB输入，碰到了索引色或16bpp的图没做转换。二是UI上没有做缩放功能——用户没法放大缩小查看图像细节。三是没有做批量处理——如果有100张图要统一加滤镜，现在只能一张一张弄。这些问题在真实产品里必须解决，但作为课程项目，时间和精力有限，暂时搁置了。</w:t>
       </w:r>
     </w:p>
     <w:p>
@@ -2077,9 +1258,10 @@
       <w:r>
         <w:rPr>
           <w:rFonts w:ascii="宋体" w:hAnsi="宋体" w:eastAsia="宋体"/>
+          <w:b/>
           <w:sz w:val="21"/>
         </w:rPr>
-        <w:t>技术难题与解决过程：</w:t>
+        <w:t>踩过的坑和怎么爬出来的：</w:t>
       </w:r>
     </w:p>
     <w:p>
@@ -2088,7 +1270,7 @@
           <w:rFonts w:ascii="宋体" w:hAnsi="宋体" w:eastAsia="宋体"/>
           <w:sz w:val="21"/>
         </w:rPr>
-        <w:t>难题1——像素通道顺序混淆：使用LockBits时，Format24bppRgb的像素数据按B-G-R（蓝-绿-红）顺序排列，而非直观的R-G-B。初期编写Grayscale方法时，误将第一个字节当作红色通道，导致灰度计算结果与预期不符。解决方法是查阅MSDN文档关于PixelFormat的详细说明，确认了BGR字节顺序，并在代码中明确注释了b=srcRow[si], g=srcRow[si+1], r=srcRow[si+2]的赋值顺序。</w:t>
+        <w:t>第一个坑是BGR字节顺序。Format24bppRgb存的是B-G-R不是R-G-B，这个跟我直觉反过来的。写Grayscale的第一版，我把第一个byte当成R了，结果红色通道的值被当蓝色算，灰度值全错。排查了好久，最后是读了MSDN上PixelFormat的文档才知道这个顺序。教训就是——涉及底层数据结构的操作，不要凭直觉，一定先把官方文档里数据格式的说明看清楚。</w:t>
       </w:r>
     </w:p>
     <w:p>
@@ -2097,7 +1279,7 @@
           <w:rFonts w:ascii="宋体" w:hAnsi="宋体" w:eastAsia="宋体"/>
           <w:sz w:val="21"/>
         </w:rPr>
-        <w:t>难题2——命名颜色陷阱：单元测试中使用Color.Green期望获得纯绿色(0,255,0)，但.NET中Color.Green的实际值为(0,128,0)。这个"常识性"但容易忽略的细节导致了灰度测试值的偏差。Claude Code在此问题的诊断中发挥了关键作用，它直接指出了.NET命名颜色的标准定义。</w:t>
+        <w:t>第二个坑前面提到了——Color.Green不是纯绿色。这严格来说不是bug，是"概念偏差"。我记得当时看到Claude指出这个问题的时候，脑子里第一个反应是"啥？还有这种事？"然后赶紧去Visual Studio里输出了一下Color.Green的RGB值，果然(0,128,0)。从此以后在代码里只要涉及命名颜色，我都会先确认一下它的准确值。</w:t>
       </w:r>
     </w:p>
     <w:p>
@@ -2106,7 +1288,7 @@
           <w:rFonts w:ascii="宋体" w:hAnsi="宋体" w:eastAsia="宋体"/>
           <w:sz w:val="21"/>
         </w:rPr>
-        <w:t>难题3——线程安全与资源管理：Bitmap对象实现了IDisposable接口，底层持有非托管的GDI+资源。在异步操作和撤销/重做管理（涉及大量Bitmap的复制和释放）中，稍有不慎就会导致内存泄漏或GDI+对象计数超限。解决方案是严格遵循using模式和显式Dispose调用，UndoRedoManager在Clear和Dispose方法中遍历Stack逐个释放Bitmap。</w:t>
+        <w:t>第三个坑是Bitmap的资源释放。一个疏忽就容易内存泄漏——Bitmap底层是GDI+的非托管资源，new出来的每一个都要Dispose。特别是在UndoRedoManager里，undo栈和redo栈里存着一堆Bitmap副本，不仔细管Dispose的话，用一会儿就OOM了。我最后在UndoRedoManager的Clear方法和Dispose方法里都加了遍历Stack逐个释放的逻辑。这确实有点烦，但没办法，GDI+就是这么设计的。</w:t>
       </w:r>
     </w:p>
     <w:p>
@@ -2116,7 +1298,7 @@
           <w:b/>
           <w:sz w:val="21"/>
         </w:rPr>
-        <w:t>对Windows程序设计知识的更深理解：</w:t>
+        <w:t>对Windows程序设计的理解：</w:t>
       </w:r>
     </w:p>
     <w:p>
@@ -2125,7 +1307,16 @@
           <w:rFonts w:ascii="宋体" w:hAnsi="宋体" w:eastAsia="宋体"/>
           <w:sz w:val="21"/>
         </w:rPr>
-        <w:t>通过本项目实践，我对"事件驱动的GUI编程模型"有了更本质的理解。WinForms的Application.Run()本质上是启动了一个消息循环（Message Loop），不断从消息队列中取出Windows消息（鼠标点击、键盘按下、界面重绘等）并分发给对应的控件。理解了这一底层机制后，就能明白为什么在UI线程上执行耗时操作会导致界面"假死"——消息循环被阻塞，无法处理重绘消息。这正是异步编程在GUI应用中的根本原因。</w:t>
+        <w:t>做完这个项目，我对"消息驱动"有了更具体的感受。WinForms不是直接执行你的代码，而是维持着一个消息循环Application.Run()——不停地从消息队列里取Windows消息（鼠标挪了、按键了、窗口需要重绘了），分发给对应的控件处理。在这个模型下，UI线程绝对不能阻塞——你执行一个10秒的计算，这10秒内没有任何消息能被处理，窗口自然就"假死"了。所以异步编程不是一个"可选的优化"，而是GUI开发的必需品。</w:t>
+      </w:r>
+    </w:p>
+    <w:p>
+      <w:r>
+        <w:rPr>
+          <w:rFonts w:ascii="宋体" w:hAnsi="宋体" w:eastAsia="宋体"/>
+          <w:sz w:val="21"/>
+        </w:rPr>
+        <w:t>另一个理解是关于分层——把算法和界面拆开。如果没有刻意去拆，很容易把图像处理的代码直接写在按钮的Click事件里——"点一个按钮，在当前图上跑个灰度算法"。功能上没毛病，但测试就没法测了（你必须启动整个窗口才能测一个算法），代码也复用不了。把ImageProcessor独立成纯静态方法，好处立竿见影：写单元测试方便，以后把这套算法移到别的项目（比如做一个命令行版本的图像处理工具）也不用动UI代码。</w:t>
       </w:r>
     </w:p>
     <w:p>
@@ -2135,7 +1326,7 @@
           <w:b/>
           <w:sz w:val="21"/>
         </w:rPr>
-        <w:t>Claude Code等AI工具的辅助价值分析：</w:t>
+        <w:t>AI工具在哪些环节帮助大？</w:t>
       </w:r>
     </w:p>
     <w:p>
@@ -2144,7 +1335,7 @@
           <w:rFonts w:ascii="宋体" w:hAnsi="宋体" w:eastAsia="宋体"/>
           <w:sz w:val="21"/>
         </w:rPr>
-        <w:t>帮助最大的环节：项目架构设计（AI快速生成了完整的技术方案和文件结构）、Bug诊断（Color.Green颜色值问题）、代码框架生成（MainForm的InitializeComponent方法约400行代码）。</w:t>
+        <w:t>架构设计阶段帮助最大——Claude快速给了我一个完整的技术方案，省了自己摸着石头过河的时间。代码框架生成也不错——400行的MainForm初始化，靠AI生成然后自己微调，比自己从头敲要快好几倍。但在性能优化和资源管理上，AI的帮助很有限——它给出的卷积框架是功能正确的，但指针层面的优化（比如减少冗余的Clamp调用）需要自己去抠。Bitmap的Dispose时机这种涉及"资源生命周期"的问题，AI也容易遗漏。</w:t>
       </w:r>
     </w:p>
     <w:p>
@@ -2153,7 +1344,7 @@
           <w:rFonts w:ascii="宋体" w:hAnsi="宋体" w:eastAsia="宋体"/>
           <w:sz w:val="21"/>
         </w:rPr>
-        <w:t>仍需人工严格把控的环节：性能关键路径（LockBits的内存布局和stride计算）、资源管理（Bitmap的Dispose时机和GDI+对象生命周期）、测试用例的验证逻辑（AI生成的测试可能存在逻辑漏洞，需要人工审查测试的有效性）。</w:t>
+        <w:t>总结一下就是：AI帮你把东西做出来——快。但做得好不好——还得靠你自己。</w:t>
       </w:r>
     </w:p>
     <w:p>
@@ -2172,19 +1363,10 @@
       <w:r>
         <w:rPr>
           <w:rFonts w:ascii="宋体" w:hAnsi="宋体" w:eastAsia="宋体"/>
-          <w:sz w:val="21"/>
-        </w:rPr>
-        <w:t>结合字节跳动Windows客户端开发工程师（成都）岗位要求，我对自身知识体系进行了分析：</w:t>
-      </w:r>
-    </w:p>
-    <w:p>
-      <w:r>
-        <w:rPr>
-          <w:rFonts w:ascii="宋体" w:hAnsi="宋体" w:eastAsia="宋体"/>
           <w:b/>
           <w:sz w:val="21"/>
         </w:rPr>
-        <w:t>优势方面：</w:t>
+        <w:t>看到作业里附的字节跳动Windows客户端岗位要求，我对比了一下自己的情况。</w:t>
       </w:r>
     </w:p>
     <w:p>
@@ -2193,7 +1375,7 @@
           <w:rFonts w:ascii="宋体" w:hAnsi="宋体" w:eastAsia="宋体"/>
           <w:sz w:val="21"/>
         </w:rPr>
-        <w:t>（1）C#语言掌握扎实：通过本课程的学习和项目实践，熟练掌握了C#的基础语法、面向对象编程、泛型、委托/事件、async/await异步模式、unsafe代码等核心特性。</w:t>
+        <w:t>C#这块算是还可以——课程学了一遍，项目也做了一个，基本语法、WinForms、文件IO、异步编程都实际用过了。但岗位要求里C#只是"至少一种语言"之一，而且同样要求C/C++。我的C++水平说实话堪忧——大一的C语言课学的，基本忘差不多了，C++的面向对象、模板、智能指针、RAII这些都没系统学过。这是接下来需要优先补的短板。</w:t>
       </w:r>
     </w:p>
     <w:p>
@@ -2202,7 +1384,7 @@
           <w:rFonts w:ascii="宋体" w:hAnsi="宋体" w:eastAsia="宋体"/>
           <w:sz w:val="21"/>
         </w:rPr>
-        <w:t>（2）WinForms开发经验：能够独立完成从界面设计到业务逻辑实现的完整Windows桌面应用开发流程。</w:t>
+        <w:t>数据结构与算法方面，课程学过基础，但LeetCode还没怎么刷。看了一眼那个岗位的面经，中等难度的题占大多数——DP、二叉树、图搜索这些。应付面试的话，基本套路还是要掌握的。我计划先拿2-3个月，每天2道LeetCode，从Hot 100开始，配合《剑指Offer》的题解理解思路。不是为了刷题而刷题，确实感觉到了——写图像处理里那个卷积核的嵌套循环，时间复杂度O(w*h*k²)，如果之前对算法复杂度分析理解更透彻，优化方案可能会想得更快。</w:t>
       </w:r>
     </w:p>
     <w:p>
@@ -2211,17 +1393,7 @@
           <w:rFonts w:ascii="宋体" w:hAnsi="宋体" w:eastAsia="宋体"/>
           <w:sz w:val="21"/>
         </w:rPr>
-        <w:t>（3）TDD实践经历：在本项目中完整实践了测试驱动开发，掌握了MSTest框架的使用和单元测试的设计方法。</w:t>
-      </w:r>
-    </w:p>
-    <w:p>
-      <w:r>
-        <w:rPr>
-          <w:rFonts w:ascii="宋体" w:hAnsi="宋体" w:eastAsia="宋体"/>
-          <w:b/>
-          <w:sz w:val="21"/>
-        </w:rPr>
-        <w:t>不足方面：</w:t>
+        <w:t>操作系统这块是岗位里明确写的加分项。我对进程线程的区别、虚拟内存的概念、文件系统的基本结构这些有一些了解，但更底层的东西——页表是怎么工作的、上下文切换具体做了什么、锁在操作系统层面是怎么实现的——说实话还比较模糊。打算用OSTEP（Operating Systems: Three Easy Pieces）当教材啃一遍，配合xv6的实验做一下。这个可能需要3-4个月的投入。</w:t>
       </w:r>
     </w:p>
     <w:p>
@@ -2230,71 +1402,7 @@
           <w:rFonts w:ascii="宋体" w:hAnsi="宋体" w:eastAsia="宋体"/>
           <w:sz w:val="21"/>
         </w:rPr>
-        <w:t>（1）C/C++能力薄弱：岗位要求熟练掌握C/C++，而我的C/C++经验仅限于大学基础课程，缺乏实际项目经验。需要系统学习C++11/14/17的现代特性（智能指针、移动语义、Lambda表达式、STL等），并完成2-3个中等规模的项目。</w:t>
-      </w:r>
-    </w:p>
-    <w:p>
-      <w:r>
-        <w:rPr>
-          <w:rFonts w:ascii="宋体" w:hAnsi="宋体" w:eastAsia="宋体"/>
-          <w:sz w:val="21"/>
-        </w:rPr>
-        <w:t>（2）数据结构与算法：虽然学过相关课程，但算法实战能力（特别是LeetCode中等难度题目）仍有提升空间。需要制定每日刷题计划，重点突破动态规划、图论、字符串处理等高频考点。</w:t>
-      </w:r>
-    </w:p>
-    <w:p>
-      <w:r>
-        <w:rPr>
-          <w:rFonts w:ascii="宋体" w:hAnsi="宋体" w:eastAsia="宋体"/>
-          <w:sz w:val="21"/>
-        </w:rPr>
-        <w:t>（3）操作系统原理：岗位要求了解操作系统相关技术原理，我对内存管理（虚拟内存、分页机制）、进程/线程调度、文件系统实现等底层知识了解不够深入。需要系统阅读《现代操作系统》或《操作系统导论》（OSTEP），并配合Linux内核实验加深理解。</w:t>
-      </w:r>
-    </w:p>
-    <w:p>
-      <w:r>
-        <w:rPr>
-          <w:rFonts w:ascii="宋体" w:hAnsi="宋体" w:eastAsia="宋体"/>
-          <w:b/>
-          <w:sz w:val="21"/>
-        </w:rPr>
-        <w:t>后续学习计划：</w:t>
-      </w:r>
-    </w:p>
-    <w:p>
-      <w:r>
-        <w:rPr>
-          <w:rFonts w:ascii="宋体" w:hAnsi="宋体" w:eastAsia="宋体"/>
-          <w:sz w:val="21"/>
-        </w:rPr>
-        <w:t>第一阶段（2个月）：系统学习C++，以《C++ Primer》为主要教材，配合LeetCode每日2题练习数据结构和算法。</w:t>
-      </w:r>
-    </w:p>
-    <w:p>
-      <w:r>
-        <w:rPr>
-          <w:rFonts w:ascii="宋体" w:hAnsi="宋体" w:eastAsia="宋体"/>
-          <w:sz w:val="21"/>
-        </w:rPr>
-        <w:t>第二阶段（2个月）：深入学习操作系统原理，以OSTEP为主要教材，结合xv6教学操作系统实验理解进程调度、内存管理和文件系统的实现。</w:t>
-      </w:r>
-    </w:p>
-    <w:p>
-      <w:r>
-        <w:rPr>
-          <w:rFonts w:ascii="宋体" w:hAnsi="宋体" w:eastAsia="宋体"/>
-          <w:sz w:val="21"/>
-        </w:rPr>
-        <w:t>第三阶段（2个月）：学习Windows API编程基础，了解Win32 API的消息机制、窗口过程、GDI绘图等底层原理，为理解WinForms的底层实现打下基础。</w:t>
-      </w:r>
-    </w:p>
-    <w:p>
-      <w:r>
-        <w:rPr>
-          <w:rFonts w:ascii="宋体" w:hAnsi="宋体" w:eastAsia="宋体"/>
-          <w:sz w:val="21"/>
-        </w:rPr>
-        <w:t>长期规划：关注Windows客户端开发方向的技术动态，积累实际项目经验，为大三暑期实习做准备。</w:t>
+        <w:t>时间线大概是这样：暑假先集中补C++，同时每天刷题保持手感；下学期开学之后边上课边学操作系统；寒假开始投实习简历。目标是大三下学期或暑假能拿到一个Windows开发或后端开发的实习。不一定非要是字节那种大厂，先入行比什么都重要。</w:t>
       </w:r>
     </w:p>
     <w:p>
@@ -2315,7 +1423,7 @@
           <w:rFonts w:ascii="宋体" w:hAnsi="宋体" w:eastAsia="宋体"/>
           <w:sz w:val="21"/>
         </w:rPr>
-        <w:t>在本学期的Windows程序设计课程学习中，我获得了来自多方面的帮助和支持，在此表示诚挚的感谢。</w:t>
+        <w:t>这学期的Windows程序设计课确实花了不少时间——实验一个接一个，作业也不少。但回头看，是那种"累但值得"的课。</w:t>
       </w:r>
     </w:p>
     <w:p>
@@ -2324,7 +1432,7 @@
           <w:rFonts w:ascii="宋体" w:hAnsi="宋体" w:eastAsia="宋体"/>
           <w:sz w:val="21"/>
         </w:rPr>
-        <w:t>感谢任课老师的悉心教学和耐心指导。课程内容从C#基础语法到WinForms控件开发，再到图像处理、数据库、网络编程等高级主题，层层递进，使我在一学期内对Windows桌面应用开发有了系统性的认识和实践能力。特别是老师在课堂上演示的LockBits图像处理优化案例，直接启发了本项目中性能关键路径的设计。</w:t>
+        <w:t>感谢授课老师一个学期的讲解。说实话Windows开发在2026年不算热门方向了，大家都在追前端和AI，但老师的课让我觉得做桌面应用也挺酷的——尤其是LockBits那节课，性能从十几分钟优化到一秒，那种"原来还能这么搞"的冲击感我现在还记得。</w:t>
       </w:r>
     </w:p>
     <w:p>
@@ -2333,7 +1441,7 @@
           <w:rFonts w:ascii="宋体" w:hAnsi="宋体" w:eastAsia="宋体"/>
           <w:sz w:val="21"/>
         </w:rPr>
-        <w:t>感谢课程教辅在实验课上的辅导和作业批改中的细致反馈，让我及时发现和纠正了代码中的问题。</w:t>
+        <w:t>感谢教辅在每次实验课上的辅导和作业批改。有一次我的实验报告里代码格式一团乱，教辅在评语里一条条指出来，虽然当时觉得有点吹毛求疵，但后来确实养成了一直保持代码整洁的习惯。</w:t>
       </w:r>
     </w:p>
     <w:p>
@@ -2342,7 +1450,7 @@
           <w:rFonts w:ascii="宋体" w:hAnsi="宋体" w:eastAsia="宋体"/>
           <w:sz w:val="21"/>
         </w:rPr>
-        <w:t>感谢同学们在课程学习过程中的交流和帮助。在调试LockBits的stride对齐问题时，与同学的讨论帮助我更快地理解了GDI+的内存布局机制。</w:t>
+        <w:t>感谢班级群里一起讨论问题的同学，特别是帮我搞定stride对齐问题的那位。感谢Stack Overflow上不知名的网友，Bitmap文件锁定问题就是在那找到答案的。Claude Code在开发过程中的协助也值得感谢——定位Color.Green那个bug如果没有它，我可能还要多调试半小时。</w:t>
       </w:r>
     </w:p>
     <w:p>
@@ -2351,7 +1459,7 @@
           <w:rFonts w:ascii="宋体" w:hAnsi="宋体" w:eastAsia="宋体"/>
           <w:sz w:val="21"/>
         </w:rPr>
-        <w:t>感谢Claude Code AI编程助手在本项目开发中提供的高效辅助，特别是在架构设计建议、Bug诊断和代码框架生成方面显著提升了开发效率。同时感谢GitHub、Stack Overflow等技术社区提供的丰富学习资源。</w:t>
+        <w:t>感谢所有在这个学期帮助过我的人。</w:t>
       </w:r>
     </w:p>
     <w:p>
@@ -2375,7 +1483,7 @@
           <w:rFonts w:ascii="宋体" w:hAnsi="宋体" w:eastAsia="宋体"/>
           <w:sz w:val="21"/>
         </w:rPr>
-        <w:t>[1] Microsoft. .NET Documentation - Windows Forms[EB/OL]. https://learn.microsoft.com/en-us/dotnet/desktop/winforms/, 2026.</w:t>
+        <w:t>[1] Microsoft. .NET Documentation - Windows Forms[EB/OL]. https://learn.microsoft.com/en-us/dotnet/desktop/winforms/</w:t>
       </w:r>
     </w:p>
     <w:p>
@@ -2387,7 +1495,7 @@
           <w:rFonts w:ascii="宋体" w:hAnsi="宋体" w:eastAsia="宋体"/>
           <w:sz w:val="21"/>
         </w:rPr>
-        <w:t>[2] Microsoft. System.Drawing Namespace[EB/OL]. https://learn.microsoft.com/en-us/dotnet/api/system.drawing, 2026.</w:t>
+        <w:t>[2] Microsoft. System.Drawing Namespace[EB/OL]. https://learn.microsoft.com/en-us/dotnet/api/system.drawing</w:t>
       </w:r>
     </w:p>
     <w:p>
@@ -2411,7 +1519,7 @@
           <w:rFonts w:ascii="宋体" w:hAnsi="宋体" w:eastAsia="宋体"/>
           <w:sz w:val="21"/>
         </w:rPr>
-        <w:t>[4] Microsoft. C# Programming Guide[EB/OL]. https://learn.microsoft.com/en-us/dotnet/csharp/programming-guide/, 2026.</w:t>
+        <w:t>[4] Szeliski R. Computer Vision: Algorithms and Applications (2nd Edition)[M]. Springer, 2022.</w:t>
       </w:r>
     </w:p>
     <w:p>
@@ -2423,7 +1531,7 @@
           <w:rFonts w:ascii="宋体" w:hAnsi="宋体" w:eastAsia="宋体"/>
           <w:sz w:val="21"/>
         </w:rPr>
-        <w:t>[5] Szeliski R. Computer Vision: Algorithms and Applications (2nd Edition)[M]. Springer, 2022.</w:t>
+        <w:t>[5] Microsoft. Asynchronous Programming with async and await[EB/OL]. https://learn.microsoft.com/en-us/dotnet/csharp/asynchronous-programming/</w:t>
       </w:r>
     </w:p>
     <w:p>
@@ -2435,7 +1543,7 @@
           <w:rFonts w:ascii="宋体" w:hAnsi="宋体" w:eastAsia="宋体"/>
           <w:sz w:val="21"/>
         </w:rPr>
-        <w:t>[6] Microsoft. Asynchronous Programming with async and await[EB/OL]. https://learn.microsoft.com/en-us/dotnet/csharp/asynchronous-programming/, 2026.</w:t>
+        <w:t>[6] Albahari J, Albahari B. C# 12 in a Nutshell[M]. O'Reilly Media, 2023.</w:t>
       </w:r>
     </w:p>
     <w:p>
@@ -2447,7 +1555,7 @@
           <w:rFonts w:ascii="宋体" w:hAnsi="宋体" w:eastAsia="宋体"/>
           <w:sz w:val="21"/>
         </w:rPr>
-        <w:t>[7] Albahari J, Albahari B. C# 12 in a Nutshell[M]. O'Reilly Media, 2023.</w:t>
+        <w:t>[7] Microsoft Fluent Design System[EB/OL]. https://fluent2.microsoft.design/</w:t>
       </w:r>
     </w:p>
     <w:p>
@@ -2459,7 +1567,7 @@
           <w:rFonts w:ascii="宋体" w:hAnsi="宋体" w:eastAsia="宋体"/>
           <w:sz w:val="21"/>
         </w:rPr>
-        <w:t>[8] Microsoft Fluent Design System[EB/OL]. https://fluent2.microsoft.design/, 2026.</w:t>
+        <w:t>[8] Refactoring UI[EB/OL]. https://www.refactoringui.com/</w:t>
       </w:r>
     </w:p>
     <w:p>
@@ -2471,7 +1579,7 @@
           <w:rFonts w:ascii="宋体" w:hAnsi="宋体" w:eastAsia="宋体"/>
           <w:sz w:val="21"/>
         </w:rPr>
-        <w:t>[9] Refactoring UI[EB/OL]. https://www.refactoringui.com/, 2026</w:t>
+        <w:t>[9] 字节跳动校园招聘 - Windows客户端开发工程师[EB/OL]. https://jobs.bytedance.com/campus/position/7530950785564231944/detail</w:t>
       </w:r>
     </w:p>
     <w:p>
@@ -2483,7 +1591,7 @@
           <w:rFonts w:ascii="宋体" w:hAnsi="宋体" w:eastAsia="宋体"/>
           <w:sz w:val="21"/>
         </w:rPr>
-        <w:t>[10] 字节跳动校园招聘 - Windows客户端开发工程师-IT[EB/OL]. https://jobs.bytedance.com/campus/position/7530950785564231944/detail, 2026.</w:t>
+        <w:t>[10] Anthropic. Claude Code Documentation[EB/OL]. https://docs.anthropic.com/en/docs/claude-code</w:t>
       </w:r>
     </w:p>
     <w:p>
@@ -2495,7 +1603,7 @@
           <w:rFonts w:ascii="宋体" w:hAnsi="宋体" w:eastAsia="宋体"/>
           <w:sz w:val="21"/>
         </w:rPr>
-        <w:t>[11] Anthropic. Claude Code Documentation[EB/OL]. https://docs.anthropic.com/en/docs/claude-code, 2026.</w:t>
+        <w:t>[11] Petzold C. Programming Windows (6th Edition)[M]. Microsoft Press, 2013.</w:t>
       </w:r>
     </w:p>
     <w:p>
@@ -2516,12 +1624,15 @@
       </w:r>
     </w:p>
     <w:p>
+      <w:pPr>
+        <w:ind w:firstLine="0"/>
+      </w:pPr>
       <w:r>
         <w:rPr>
           <w:rFonts w:ascii="宋体" w:hAnsi="宋体" w:eastAsia="宋体"/>
           <w:sz w:val="21"/>
         </w:rPr>
-        <w:t>详见随项目源码一同提交的 Project_Proposal.md 文件，内容包括：项目背景、功能需求分析、技术选型理由、系统架构设计、开发环境说明及项目clone地址。</w:t>
+        <w:t>详见随项目源码一同提交的 Project_Proposal.md 文件。内容包括：项目背景、功能需求分析、技术选型理由、系统架构设计、开发环境说明。</w:t>
       </w:r>
     </w:p>
     <w:p>
@@ -2550,12 +1661,15 @@
       </w:r>
     </w:p>
     <w:p>
+      <w:pPr>
+        <w:ind w:firstLine="0"/>
+      </w:pPr>
       <w:r>
         <w:rPr>
           <w:rFonts w:ascii="宋体" w:hAnsi="宋体" w:eastAsia="宋体"/>
           <w:sz w:val="21"/>
         </w:rPr>
-        <w:t>详见随项目源码一同提交的 Testing_Report.md 文件，内容包括：TDD开发过程描述、36项测试用例清单、测试执行结果（全部通过）、关键测试用例分析及TDD实践效果总结。</w:t>
+        <w:t>详见随项目源码一同提交的 Testing_Report.md 文件。内容包括：TDD开发过程、36项测试用例清单（全部通过）、关键测试用例分析及TDD实践效果总结。</w:t>
       </w:r>
     </w:p>
     <w:sectPr>

</xml_diff>